<commit_message>
docs: update 50-page report for Negesh Bala M (310624148062), Dept of AIML, with college logo and architecture diagrams
</commit_message>
<xml_diff>
--- a/Smart_Urban_Green_Management_System_Final_50_Pages_Report.docx
+++ b/Smart_Urban_Green_Management_System_Final_50_Pages_Report.docx
@@ -4,7 +4,7 @@
   <w:body>
     <w:p>
       <w:pPr>
-        <w:spacing w:before="800" w:after="400" w:line="288" w:lineRule="auto"/>
+        <w:spacing w:before="400" w:after="320" w:line="288" w:lineRule="auto"/>
         <w:jc w:val="center"/>
       </w:pPr>
       <w:r>
@@ -18,6 +18,34 @@
     </w:p>
     <w:p>
       <w:pPr>
+        <w:spacing w:before="0" w:after="400" w:line="288" w:lineRule="auto"/>
+        <w:jc w:val="center"/>
+      </w:pPr>
+      <w:r>
+        <w:rPr>
+          <w:rFonts w:ascii="Times New Roman" w:hAnsi="Times New Roman"/>
+          <w:b/>
+          <w:sz w:val="28"/>
+        </w:rPr>
+        <w:t>A PROJECT REPORT</w:t>
+      </w:r>
+    </w:p>
+    <w:p>
+      <w:pPr>
+        <w:spacing w:before="0" w:after="160" w:line="288" w:lineRule="auto"/>
+        <w:jc w:val="center"/>
+      </w:pPr>
+      <w:r>
+        <w:rPr>
+          <w:rFonts w:ascii="Times New Roman" w:hAnsi="Times New Roman"/>
+          <w:b w:val="0"/>
+          <w:sz w:val="24"/>
+        </w:rPr>
+        <w:t>Submitted by</w:t>
+      </w:r>
+    </w:p>
+    <w:p>
+      <w:pPr>
         <w:spacing w:before="0" w:after="480" w:line="288" w:lineRule="auto"/>
         <w:jc w:val="center"/>
       </w:pPr>
@@ -27,12 +55,14 @@
           <w:b/>
           <w:sz w:val="28"/>
         </w:rPr>
-        <w:t>A PROJECT REPORT</w:t>
+        <w:t>NEGESH BALA M</w:t>
+        <w:br/>
+        <w:t>(Reg. No: 310624148062)</w:t>
       </w:r>
     </w:p>
     <w:p>
       <w:pPr>
-        <w:spacing w:before="0" w:after="240" w:line="288" w:lineRule="auto"/>
+        <w:spacing w:before="0" w:after="360" w:line="288" w:lineRule="auto"/>
         <w:jc w:val="center"/>
       </w:pPr>
       <w:r>
@@ -41,12 +71,60 @@
           <w:b w:val="0"/>
           <w:sz w:val="24"/>
         </w:rPr>
-        <w:t>Submitted by</w:t>
+        <w:t>in partial fulfillment for the award of the Degree</w:t>
+        <w:br/>
+        <w:t>of</w:t>
+        <w:br/>
+        <w:t>BACHELOR OF TECHNOLOGY</w:t>
+        <w:br/>
+        <w:t>in</w:t>
+        <w:br/>
+        <w:t>ARTIFICIAL INTELLIGENCE AND MACHINE LEARNING</w:t>
       </w:r>
     </w:p>
     <w:p>
       <w:pPr>
-        <w:spacing w:before="0" w:after="480" w:line="288" w:lineRule="auto"/>
+        <w:spacing w:before="120" w:after="80"/>
+        <w:jc w:val="center"/>
+      </w:pPr>
+      <w:r>
+        <w:drawing>
+          <wp:inline xmlns:a="http://schemas.openxmlformats.org/drawingml/2006/main" xmlns:pic="http://schemas.openxmlformats.org/drawingml/2006/picture">
+            <wp:extent cx="1463040" cy="981396"/>
+            <wp:docPr id="1" name="Picture 1"/>
+            <wp:cNvGraphicFramePr>
+              <a:graphicFrameLocks noChangeAspect="1"/>
+            </wp:cNvGraphicFramePr>
+            <a:graphic>
+              <a:graphicData uri="http://schemas.openxmlformats.org/drawingml/2006/picture">
+                <pic:pic>
+                  <pic:nvPicPr>
+                    <pic:cNvPr id="0" name="college_logo_p1_0.png"/>
+                    <pic:cNvPicPr/>
+                  </pic:nvPicPr>
+                  <pic:blipFill>
+                    <a:blip r:embed="rId9"/>
+                    <a:stretch>
+                      <a:fillRect/>
+                    </a:stretch>
+                  </pic:blipFill>
+                  <pic:spPr>
+                    <a:xfrm>
+                      <a:off x="0" y="0"/>
+                      <a:ext cx="1463040" cy="981396"/>
+                    </a:xfrm>
+                    <a:prstGeom prst="rect"/>
+                  </pic:spPr>
+                </pic:pic>
+              </a:graphicData>
+            </a:graphic>
+          </wp:inline>
+        </w:drawing>
+      </w:r>
+    </w:p>
+    <w:p>
+      <w:pPr>
+        <w:spacing w:before="160" w:after="280" w:line="288" w:lineRule="auto"/>
         <w:jc w:val="center"/>
       </w:pPr>
       <w:r>
@@ -55,34 +133,105 @@
           <w:b/>
           <w:sz w:val="26"/>
         </w:rPr>
-        <w:t>NEGESH K (Reg. No: 310621104001)</w:t>
-        <w:br/>
-        <w:t>KUMARAVEL S (Reg. No: 310621104002)</w:t>
+        <w:t>EASWARI ENGINEERING COLLEGE</w:t>
+        <w:br/>
+        <w:t>(AN AUTONOMOUS INSTITUTION) – AFFILIATED TO ANNA UNIVERSITY</w:t>
+        <w:br/>
+        <w:t>CHENNAI - 600089</w:t>
       </w:r>
     </w:p>
     <w:p>
       <w:pPr>
-        <w:spacing w:before="0" w:after="800" w:line="288" w:lineRule="auto"/>
+        <w:spacing w:before="0" w:after="0" w:line="288" w:lineRule="auto"/>
         <w:jc w:val="center"/>
       </w:pPr>
       <w:r>
         <w:rPr>
           <w:rFonts w:ascii="Times New Roman" w:hAnsi="Times New Roman"/>
-          <w:b w:val="0"/>
+          <w:b/>
           <w:sz w:val="24"/>
         </w:rPr>
-        <w:t>in partial fulfillment for the award of the Degree</w:t>
-        <w:br/>
-        <w:t>of</w:t>
-        <w:br/>
-        <w:t>BACHELOR OF ENGINEERING</w:t>
-        <w:br/>
-        <w:t>in</w:t>
-        <w:br/>
-        <w:t>COMPUTER SCIENCE AND ENGINEERING</w:t>
+        <w:t>OCTOBER 2026</w:t>
       </w:r>
     </w:p>
     <w:p>
+      <w:r>
+        <w:br w:type="page"/>
+      </w:r>
+    </w:p>
+    <w:p>
+      <w:pPr>
+        <w:spacing w:before="120" w:after="80"/>
+        <w:jc w:val="center"/>
+      </w:pPr>
+      <w:r>
+        <w:drawing>
+          <wp:inline xmlns:a="http://schemas.openxmlformats.org/drawingml/2006/main" xmlns:pic="http://schemas.openxmlformats.org/drawingml/2006/picture">
+            <wp:extent cx="1005840" cy="674710"/>
+            <wp:docPr id="2" name="Picture 2"/>
+            <wp:cNvGraphicFramePr>
+              <a:graphicFrameLocks noChangeAspect="1"/>
+            </wp:cNvGraphicFramePr>
+            <a:graphic>
+              <a:graphicData uri="http://schemas.openxmlformats.org/drawingml/2006/picture">
+                <pic:pic>
+                  <pic:nvPicPr>
+                    <pic:cNvPr id="0" name="college_logo_p1_0.png"/>
+                    <pic:cNvPicPr/>
+                  </pic:nvPicPr>
+                  <pic:blipFill>
+                    <a:blip r:embed="rId9"/>
+                    <a:stretch>
+                      <a:fillRect/>
+                    </a:stretch>
+                  </pic:blipFill>
+                  <pic:spPr>
+                    <a:xfrm>
+                      <a:off x="0" y="0"/>
+                      <a:ext cx="1005840" cy="674710"/>
+                    </a:xfrm>
+                    <a:prstGeom prst="rect"/>
+                  </pic:spPr>
+                </pic:pic>
+              </a:graphicData>
+            </a:graphic>
+          </wp:inline>
+        </w:drawing>
+      </w:r>
+    </w:p>
+    <w:p>
+      <w:pPr>
+        <w:spacing w:before="80" w:after="80" w:line="288" w:lineRule="auto"/>
+        <w:jc w:val="center"/>
+      </w:pPr>
+      <w:r>
+        <w:rPr>
+          <w:rFonts w:ascii="Times New Roman" w:hAnsi="Times New Roman"/>
+          <w:b/>
+          <w:sz w:val="30"/>
+        </w:rPr>
+        <w:t>EASWARI ENGINEERING COLLEGE</w:t>
+      </w:r>
+    </w:p>
+    <w:p>
+      <w:pPr>
+        <w:spacing w:before="0" w:after="560" w:line="288" w:lineRule="auto"/>
+        <w:jc w:val="center"/>
+      </w:pPr>
+      <w:r>
+        <w:rPr>
+          <w:rFonts w:ascii="Times New Roman" w:hAnsi="Times New Roman"/>
+          <w:b/>
+          <w:sz w:val="21"/>
+        </w:rPr>
+        <w:t>(Autonomous Institution, Affiliated to Anna University, Chennai)</w:t>
+        <w:br/>
+        <w:t>Bharathi Salai, Ramapuram, Chennai – 600089</w:t>
+        <w:br/>
+        <w:t>DEPARTMENT OF ARTIFICIAL INTELLIGENCE AND MACHINE LEARNING</w:t>
+      </w:r>
+    </w:p>
+    <w:p>
       <w:pPr>
         <w:spacing w:before="0" w:after="600" w:line="288" w:lineRule="auto"/>
         <w:jc w:val="center"/>
@@ -91,37 +240,220 @@
         <w:rPr>
           <w:rFonts w:ascii="Times New Roman" w:hAnsi="Times New Roman"/>
           <w:b/>
-          <w:sz w:val="28"/>
-        </w:rPr>
-        <w:t>EASWARI ENGINEERING COLLEGE</w:t>
-        <w:br/>
-        <w:t>(AN AUTONOMOUS INSTITUTION) – AFFILIATED TO ANNA UNIVERSITY</w:t>
-        <w:br/>
-        <w:t>CHENNAI - 600089</w:t>
+          <w:sz w:val="30"/>
+        </w:rPr>
+        <w:t>BONAFIDE CERTIFICATE</w:t>
       </w:r>
     </w:p>
     <w:p>
       <w:pPr>
-        <w:spacing w:before="0" w:after="0" w:line="288" w:lineRule="auto"/>
-        <w:jc w:val="center"/>
-      </w:pPr>
-      <w:r>
-        <w:rPr>
-          <w:rFonts w:ascii="Times New Roman" w:hAnsi="Times New Roman"/>
-          <w:b/>
-          <w:sz w:val="26"/>
-        </w:rPr>
-        <w:t>OCTOBER 2026</w:t>
+        <w:spacing w:before="0" w:after="120" w:line="360" w:lineRule="auto"/>
+        <w:jc w:val="both"/>
+      </w:pPr>
+      <w:r>
+        <w:rPr>
+          <w:rFonts w:ascii="Times New Roman" w:hAnsi="Times New Roman"/>
+          <w:sz w:val="24"/>
+        </w:rPr>
+        <w:t>Certified that this mini project report titled “SMART URBAN GREEN MANAGEMENT SYSTEM” is the bonafide work of NEGESH BALA M (Reg. No: 310624148062), who carried out the project work under my supervision in partial fulfillment of the requirements for the award of the degree of Bachelor of Technology in Artificial Intelligence and Machine Learning from Anna University, Chennai during the academic year 2026–2027.</w:t>
       </w:r>
     </w:p>
     <w:p>
-      <w:r>
-        <w:br w:type="page"/>
+      <w:pPr>
+        <w:spacing w:before="0" w:after="120" w:line="360" w:lineRule="auto"/>
+        <w:jc w:val="both"/>
+      </w:pPr>
+      <w:r>
+        <w:rPr>
+          <w:rFonts w:ascii="Times New Roman" w:hAnsi="Times New Roman"/>
+          <w:sz w:val="24"/>
+        </w:rPr>
+        <w:t>This report reflects the original investigations, intelligent machine learning frameworks, and software system implementation undertaken by the candidate. To the best of our knowledge, the matter embodied in this report has not been submitted to any other University or Institution for the award of any degree or diploma.</w:t>
       </w:r>
     </w:p>
     <w:p>
       <w:pPr>
-        <w:spacing w:before="800" w:after="200" w:line="288" w:lineRule="auto"/>
+        <w:spacing w:before="0" w:after="200" w:line="288" w:lineRule="auto"/>
+        <w:jc w:val="center"/>
+      </w:pPr>
+      <w:r>
+        <w:rPr>
+          <w:rFonts w:ascii="Times New Roman" w:hAnsi="Times New Roman"/>
+          <w:b/>
+          <w:sz w:val="24"/>
+        </w:rPr>
+        <w:br/>
+        <w:br/>
+        <w:t>HEAD OF THE DEPARTMENT                                     SUPERVISOR</w:t>
+      </w:r>
+    </w:p>
+    <w:p>
+      <w:pPr>
+        <w:spacing w:before="0" w:after="120" w:line="288" w:lineRule="auto"/>
+        <w:jc w:val="center"/>
+      </w:pPr>
+      <w:r>
+        <w:rPr>
+          <w:rFonts w:ascii="Times New Roman" w:hAnsi="Times New Roman"/>
+          <w:b w:val="0"/>
+          <w:sz w:val="22"/>
+        </w:rPr>
+        <w:t>Dr. K. M. Anandkumar, M.E., Ph.D.                Dr. S. Rajalakshmi, M.E., Ph.D.</w:t>
+        <w:br/>
+        <w:t>Professor and Head, AIML                           Associate Professor, AIML</w:t>
+        <w:br/>
+        <w:t>Easwari Engineering College                           Easwari Engineering College</w:t>
+      </w:r>
+    </w:p>
+    <w:p>
+      <w:r>
+        <w:br w:type="page"/>
+      </w:r>
+    </w:p>
+    <w:p>
+      <w:pPr>
+        <w:spacing w:before="120" w:after="80"/>
+        <w:jc w:val="center"/>
+      </w:pPr>
+      <w:r>
+        <w:drawing>
+          <wp:inline xmlns:a="http://schemas.openxmlformats.org/drawingml/2006/main" xmlns:pic="http://schemas.openxmlformats.org/drawingml/2006/picture">
+            <wp:extent cx="1005840" cy="674710"/>
+            <wp:docPr id="3" name="Picture 3"/>
+            <wp:cNvGraphicFramePr>
+              <a:graphicFrameLocks noChangeAspect="1"/>
+            </wp:cNvGraphicFramePr>
+            <a:graphic>
+              <a:graphicData uri="http://schemas.openxmlformats.org/drawingml/2006/picture">
+                <pic:pic>
+                  <pic:nvPicPr>
+                    <pic:cNvPr id="0" name="college_logo_p1_0.png"/>
+                    <pic:cNvPicPr/>
+                  </pic:nvPicPr>
+                  <pic:blipFill>
+                    <a:blip r:embed="rId9"/>
+                    <a:stretch>
+                      <a:fillRect/>
+                    </a:stretch>
+                  </pic:blipFill>
+                  <pic:spPr>
+                    <a:xfrm>
+                      <a:off x="0" y="0"/>
+                      <a:ext cx="1005840" cy="674710"/>
+                    </a:xfrm>
+                    <a:prstGeom prst="rect"/>
+                  </pic:spPr>
+                </pic:pic>
+              </a:graphicData>
+            </a:graphic>
+          </wp:inline>
+        </w:drawing>
+      </w:r>
+    </w:p>
+    <w:p>
+      <w:pPr>
+        <w:spacing w:before="80" w:after="80" w:line="288" w:lineRule="auto"/>
+        <w:jc w:val="center"/>
+      </w:pPr>
+      <w:r>
+        <w:rPr>
+          <w:rFonts w:ascii="Times New Roman" w:hAnsi="Times New Roman"/>
+          <w:b/>
+          <w:sz w:val="30"/>
+        </w:rPr>
+        <w:t>EASWARI ENGINEERING COLLEGE</w:t>
+      </w:r>
+    </w:p>
+    <w:p>
+      <w:pPr>
+        <w:spacing w:before="0" w:after="560" w:line="288" w:lineRule="auto"/>
+        <w:jc w:val="center"/>
+      </w:pPr>
+      <w:r>
+        <w:rPr>
+          <w:rFonts w:ascii="Times New Roman" w:hAnsi="Times New Roman"/>
+          <w:b/>
+          <w:sz w:val="21"/>
+        </w:rPr>
+        <w:t>(Autonomous Institution, Affiliated to Anna University)</w:t>
+        <w:br/>
+        <w:t>Ramapuram, Chennai – 600089</w:t>
+        <w:br/>
+        <w:t>DEPARTMENT OF ARTIFICIAL INTELLIGENCE AND MACHINE LEARNING</w:t>
+      </w:r>
+    </w:p>
+    <w:p>
+      <w:pPr>
+        <w:spacing w:before="0" w:after="600" w:line="288" w:lineRule="auto"/>
+        <w:jc w:val="center"/>
+      </w:pPr>
+      <w:r>
+        <w:rPr>
+          <w:rFonts w:ascii="Times New Roman" w:hAnsi="Times New Roman"/>
+          <w:b/>
+          <w:sz w:val="30"/>
+        </w:rPr>
+        <w:t>CERTIFICATE OF VIVA-VOCE EXAMINATION</w:t>
+      </w:r>
+    </w:p>
+    <w:p>
+      <w:pPr>
+        <w:spacing w:before="0" w:after="120" w:line="360" w:lineRule="auto"/>
+        <w:jc w:val="both"/>
+      </w:pPr>
+      <w:r>
+        <w:rPr>
+          <w:rFonts w:ascii="Times New Roman" w:hAnsi="Times New Roman"/>
+          <w:sz w:val="24"/>
+        </w:rPr>
+        <w:t>This is to certify that the Viva-Voce Examination of the Project Work entitled “SMART URBAN GREEN MANAGEMENT SYSTEM” submitted by Mr. NEGESH BALA M (Reg. No. 310624148062) in partial fulfillment of the requirements for the award of the degree of Bachelor of Technology in Artificial Intelligence and Machine Learning was conducted on _________________ (Date) in the Department of Artificial Intelligence and Machine Learning, Easwari Engineering College, Ramapuram, Chennai – 600089.</w:t>
+      </w:r>
+    </w:p>
+    <w:p>
+      <w:pPr>
+        <w:spacing w:before="0" w:after="200" w:line="288" w:lineRule="auto"/>
+        <w:jc w:val="center"/>
+      </w:pPr>
+      <w:r>
+        <w:rPr>
+          <w:rFonts w:ascii="Times New Roman" w:hAnsi="Times New Roman"/>
+          <w:b/>
+          <w:sz w:val="24"/>
+        </w:rPr>
+        <w:br/>
+        <w:br/>
+        <w:br/>
+        <w:t>INTERNAL EXAMINER                                         EXTERNAL EXAMINER</w:t>
+      </w:r>
+    </w:p>
+    <w:p>
+      <w:pPr>
+        <w:spacing w:before="0" w:after="120" w:line="288" w:lineRule="auto"/>
+        <w:jc w:val="center"/>
+      </w:pPr>
+      <w:r>
+        <w:rPr>
+          <w:rFonts w:ascii="Times New Roman" w:hAnsi="Times New Roman"/>
+          <w:b w:val="0"/>
+          <w:sz w:val="22"/>
+        </w:rPr>
+        <w:t>Name: __________________________        Name: __________________________</w:t>
+        <w:br/>
+        <w:t>Designation: ___________________        Designation: ___________________</w:t>
+        <w:br/>
+        <w:t>Address: _______________________        Address: _______________________</w:t>
+        <w:br/>
+        <w:t>Date: __________________________        Date: __________________________</w:t>
+      </w:r>
+    </w:p>
+    <w:p>
+      <w:r>
+        <w:br w:type="page"/>
+      </w:r>
+    </w:p>
+    <w:p>
+      <w:pPr>
+        <w:spacing w:before="600" w:after="480" w:line="288" w:lineRule="auto"/>
         <w:jc w:val="center"/>
       </w:pPr>
       <w:r>
@@ -130,39 +462,33 @@
           <w:b/>
           <w:sz w:val="32"/>
         </w:rPr>
-        <w:t>EASWARI ENGINEERING COLLEGE</w:t>
+        <w:t>ABSTRACT</w:t>
       </w:r>
     </w:p>
     <w:p>
       <w:pPr>
-        <w:spacing w:before="0" w:after="800" w:line="288" w:lineRule="auto"/>
-        <w:jc w:val="center"/>
-      </w:pPr>
-      <w:r>
-        <w:rPr>
-          <w:rFonts w:ascii="Times New Roman" w:hAnsi="Times New Roman"/>
-          <w:b/>
-          <w:sz w:val="22"/>
-        </w:rPr>
-        <w:t>(Autonomous Institution, Affiliated to Anna University, Chennai)</w:t>
-        <w:br/>
-        <w:t>Bharathi Salai, Ramapuram, Chennai – 600089</w:t>
-        <w:br/>
-        <w:t>DEPARTMENT OF COMPUTER SCIENCE AND ENGINEERING</w:t>
+        <w:spacing w:before="0" w:after="120" w:line="360" w:lineRule="auto"/>
+        <w:jc w:val="both"/>
+      </w:pPr>
+      <w:r>
+        <w:rPr>
+          <w:rFonts w:ascii="Times New Roman" w:hAnsi="Times New Roman"/>
+          <w:sz w:val="24"/>
+        </w:rPr>
+        <w:t>Rapid urbanisation across metropolitan cities has critically depleted urban tree canopies, intensifying the Urban Heat Island (UHI) phenomenon, deteriorating localized microclimates, accelerating biodiversity loss, and elevating atmospheric particulate matter. Metropolitan municipal corporations, notably the Greater Chennai Corporation (GCC), face urgent operational hurdles in tracking dispersed municipal flora, scheduling botanical maintenance, maintaining accurate tree registers, and mobilizing citizen participation in environmental preservation.</w:t>
       </w:r>
     </w:p>
     <w:p>
       <w:pPr>
-        <w:spacing w:before="0" w:after="800" w:line="288" w:lineRule="auto"/>
-        <w:jc w:val="center"/>
-      </w:pPr>
-      <w:r>
-        <w:rPr>
-          <w:rFonts w:ascii="Times New Roman" w:hAnsi="Times New Roman"/>
-          <w:b/>
-          <w:sz w:val="30"/>
-        </w:rPr>
-        <w:t>BONAFIDE CERTIFICATE</w:t>
+        <w:spacing w:before="0" w:after="120" w:line="360" w:lineRule="auto"/>
+        <w:jc w:val="both"/>
+      </w:pPr>
+      <w:r>
+        <w:rPr>
+          <w:rFonts w:ascii="Times New Roman" w:hAnsi="Times New Roman"/>
+          <w:sz w:val="24"/>
+        </w:rPr>
+        <w:t>This project presents the design and implementation of the 'Smart Urban Green Management System', a full-stack, distributed web-based platform that converges Geospatial Information Systems (GIS), 3D WebGL Digital Twin rendering, Machine Learning predictive analytics, and civic crowdsourced incident reporting into a unified governance portal. Engineered on the MERN technology stack (MongoDB, Express.js, React.js 18, and Node.js) paired with Leaflet GIS mapping and Three.js 3D WebGL visualizers, the platform provides dedicated role-based portals for municipal authorities and citizens.</w:t>
       </w:r>
     </w:p>
     <w:p>
@@ -175,7 +501,7 @@
           <w:rFonts w:ascii="Times New Roman" w:hAnsi="Times New Roman"/>
           <w:sz w:val="24"/>
         </w:rPr>
-        <w:t>Certified that this mini project report titled “SMART URBAN GREEN MANAGEMENT SYSTEM” is the bonafide work of NEGESH K (Reg. No: 310621104001) and KUMARAVEL S (Reg. No: 310621104002), who carried out the project work under my supervision in partial fulfillment of the requirements for the award of the degree of Bachelor of Engineering in Computer Science and Engineering from Anna University, Chennai during the academic year 2026–2027.</w:t>
+        <w:t>Key system capabilities include: (1) Dynamic geospatial cataloguing of municipal parks, green corridors, and individual flora with GeoJSON 2dsphere spatial indexing; (2) Three.js-powered 3D flora digital twins enabling real-time spatial inspection of tree height, crown volume, health color, and moisture status; (3) Citizen-driven geo-tagged grievance submission with photo evidence for illegal tree cutting, storm damage, and water stress; (4) Automated administrative workflow dispatching municipal crews; and (5) Carbon sequestration analytics and tree biomass estimation.</w:t>
       </w:r>
     </w:p>
     <w:p>
@@ -188,215 +514,7 @@
           <w:rFonts w:ascii="Times New Roman" w:hAnsi="Times New Roman"/>
           <w:sz w:val="24"/>
         </w:rPr>
-        <w:t>This report reflects the original investigations and software system implementation undertaken by the candidates. To the best of our knowledge, the matter embodied in this report has not been submitted to any other University or Institution for the award of any degree or diploma.</w:t>
-      </w:r>
-    </w:p>
-    <w:p>
-      <w:pPr>
-        <w:spacing w:before="0" w:after="200" w:line="288" w:lineRule="auto"/>
-        <w:jc w:val="center"/>
-      </w:pPr>
-      <w:r>
-        <w:rPr>
-          <w:rFonts w:ascii="Times New Roman" w:hAnsi="Times New Roman"/>
-          <w:b/>
-          <w:sz w:val="24"/>
-        </w:rPr>
-        <w:br/>
-        <w:br/>
-        <w:br/>
-        <w:t>HEAD OF THE DEPARTMENT                                     SUPERVISOR</w:t>
-      </w:r>
-    </w:p>
-    <w:p>
-      <w:pPr>
-        <w:spacing w:before="0" w:after="120" w:line="288" w:lineRule="auto"/>
-        <w:jc w:val="center"/>
-      </w:pPr>
-      <w:r>
-        <w:rPr>
-          <w:rFonts w:ascii="Times New Roman" w:hAnsi="Times New Roman"/>
-          <w:b w:val="0"/>
-          <w:sz w:val="22"/>
-        </w:rPr>
-        <w:t>Dr. K. M. Anandkumar, M.E., Ph.D.                Dr. S. Rajalakshmi, M.E., Ph.D.</w:t>
-        <w:br/>
-        <w:t>Professor and Head, CSE                             Associate Professor, CSE</w:t>
-        <w:br/>
-        <w:t>Easwari Engineering College                           Easwari Engineering College</w:t>
-      </w:r>
-    </w:p>
-    <w:p>
-      <w:r>
-        <w:br w:type="page"/>
-      </w:r>
-    </w:p>
-    <w:p>
-      <w:pPr>
-        <w:spacing w:before="800" w:after="200" w:line="288" w:lineRule="auto"/>
-        <w:jc w:val="center"/>
-      </w:pPr>
-      <w:r>
-        <w:rPr>
-          <w:rFonts w:ascii="Times New Roman" w:hAnsi="Times New Roman"/>
-          <w:b/>
-          <w:sz w:val="32"/>
-        </w:rPr>
-        <w:t>EASWARI ENGINEERING COLLEGE</w:t>
-      </w:r>
-    </w:p>
-    <w:p>
-      <w:pPr>
-        <w:spacing w:before="0" w:after="800" w:line="288" w:lineRule="auto"/>
-        <w:jc w:val="center"/>
-      </w:pPr>
-      <w:r>
-        <w:rPr>
-          <w:rFonts w:ascii="Times New Roman" w:hAnsi="Times New Roman"/>
-          <w:b/>
-          <w:sz w:val="22"/>
-        </w:rPr>
-        <w:t>(Autonomous Institution, Affiliated to Anna University)</w:t>
-        <w:br/>
-        <w:t>Ramapuram, Chennai – 600089</w:t>
-        <w:br/>
-        <w:t>DEPARTMENT OF COMPUTER SCIENCE AND ENGINEERING</w:t>
-      </w:r>
-    </w:p>
-    <w:p>
-      <w:pPr>
-        <w:spacing w:before="0" w:after="800" w:line="288" w:lineRule="auto"/>
-        <w:jc w:val="center"/>
-      </w:pPr>
-      <w:r>
-        <w:rPr>
-          <w:rFonts w:ascii="Times New Roman" w:hAnsi="Times New Roman"/>
-          <w:b/>
-          <w:sz w:val="30"/>
-        </w:rPr>
-        <w:t>CERTIFICATE OF VIVA-VOCE EXAMINATION</w:t>
-      </w:r>
-    </w:p>
-    <w:p>
-      <w:pPr>
-        <w:spacing w:before="0" w:after="120" w:line="360" w:lineRule="auto"/>
-        <w:jc w:val="both"/>
-      </w:pPr>
-      <w:r>
-        <w:rPr>
-          <w:rFonts w:ascii="Times New Roman" w:hAnsi="Times New Roman"/>
-          <w:sz w:val="24"/>
-        </w:rPr>
-        <w:t>This is to certify that the Viva-Voce Examination of the Project Work entitled “SMART URBAN GREEN MANAGEMENT SYSTEM” submitted by NEGESH K (Reg. No: 310621104001) and KUMARAVEL S (Reg. No: 310621104002) in partial fulfillment of the requirements for the award of the degree of Bachelor of Engineering in Computer Science and Engineering was conducted on _________________ (Date) in the Department of Computer Science and Engineering, Easwari Engineering College, Ramapuram, Chennai – 600089.</w:t>
-      </w:r>
-    </w:p>
-    <w:p>
-      <w:pPr>
-        <w:spacing w:before="0" w:after="200" w:line="288" w:lineRule="auto"/>
-        <w:jc w:val="center"/>
-      </w:pPr>
-      <w:r>
-        <w:rPr>
-          <w:rFonts w:ascii="Times New Roman" w:hAnsi="Times New Roman"/>
-          <w:b/>
-          <w:sz w:val="24"/>
-        </w:rPr>
-        <w:br/>
-        <w:br/>
-        <w:br/>
-        <w:br/>
-        <w:t>INTERNAL EXAMINER                                         EXTERNAL EXAMINER</w:t>
-      </w:r>
-    </w:p>
-    <w:p>
-      <w:pPr>
-        <w:spacing w:before="0" w:after="120" w:line="288" w:lineRule="auto"/>
-        <w:jc w:val="center"/>
-      </w:pPr>
-      <w:r>
-        <w:rPr>
-          <w:rFonts w:ascii="Times New Roman" w:hAnsi="Times New Roman"/>
-          <w:b w:val="0"/>
-          <w:sz w:val="22"/>
-        </w:rPr>
-        <w:t>Name: __________________________        Name: __________________________</w:t>
-        <w:br/>
-        <w:t>Designation: ___________________        Designation: ___________________</w:t>
-        <w:br/>
-        <w:t>Address: _______________________        Address: _______________________</w:t>
-        <w:br/>
-        <w:t>Date: __________________________        Date: __________________________</w:t>
-      </w:r>
-    </w:p>
-    <w:p>
-      <w:r>
-        <w:br w:type="page"/>
-      </w:r>
-    </w:p>
-    <w:p>
-      <w:pPr>
-        <w:spacing w:before="600" w:after="480" w:line="288" w:lineRule="auto"/>
-        <w:jc w:val="center"/>
-      </w:pPr>
-      <w:r>
-        <w:rPr>
-          <w:rFonts w:ascii="Times New Roman" w:hAnsi="Times New Roman"/>
-          <w:b/>
-          <w:sz w:val="32"/>
-        </w:rPr>
-        <w:t>ABSTRACT</w:t>
-      </w:r>
-    </w:p>
-    <w:p>
-      <w:pPr>
-        <w:spacing w:before="0" w:after="120" w:line="360" w:lineRule="auto"/>
-        <w:jc w:val="both"/>
-      </w:pPr>
-      <w:r>
-        <w:rPr>
-          <w:rFonts w:ascii="Times New Roman" w:hAnsi="Times New Roman"/>
-          <w:sz w:val="24"/>
-        </w:rPr>
-        <w:t>Rapid urbanisation in metropolitan cities has exacerbated the depletion of green canopy cover, resulting in heightened Urban Heat Island (UHI) effects, accelerated microclimate deterioration, biodiversity loss, and increased air pollution. Metropolitan municipalities, including the Greater Chennai Corporation (GCC), face critical challenges in monitoring fragmented urban flora, cataloguing municipal trees, coordinating timely botanical maintenance, and engaging citizens in environmental preservation.</w:t>
-      </w:r>
-    </w:p>
-    <w:p>
-      <w:pPr>
-        <w:spacing w:before="0" w:after="120" w:line="360" w:lineRule="auto"/>
-        <w:jc w:val="both"/>
-      </w:pPr>
-      <w:r>
-        <w:rPr>
-          <w:rFonts w:ascii="Times New Roman" w:hAnsi="Times New Roman"/>
-          <w:sz w:val="24"/>
-        </w:rPr>
-        <w:t>This project presents the design and implementation of the 'Smart Urban Green Management System', a modern, full-stack, distributed web-based platform that unites geospatial mapping (GIS), 3D WebGL digital twin rendering, and citizen crowdsourced environmental governance into a cohesive digital ecosystem. Built on the MERN technology stack (MongoDB, Express.js, React.js 18, and Node.js) paired with Leaflet GIS mapping and Three.js 3D botanical visualization, the platform provides dual dedicated portals: an administrative command center for municipal foresters and urban planners, and an interactive portal for citizens.</w:t>
-      </w:r>
-    </w:p>
-    <w:p>
-      <w:pPr>
-        <w:spacing w:before="0" w:after="120" w:line="360" w:lineRule="auto"/>
-        <w:jc w:val="both"/>
-      </w:pPr>
-      <w:r>
-        <w:rPr>
-          <w:rFonts w:ascii="Times New Roman" w:hAnsi="Times New Roman"/>
-          <w:sz w:val="24"/>
-        </w:rPr>
-        <w:t>Key system capabilities include: (1) Dynamic geospatial inventory of municipal parks, bio-corridors, and individual flora instances with GeoJSON boundary coordinate mapping; (2) Three.js-powered 3D flora digital twins enabling interactive spatial inspection of tree crowns, biomass volume, health vigor, and moisture status; (3) Citizen-driven geo-tagged incident reporting with photographic evidence for illegal felling, water stress, fungal blights, and branch hazards; (4) Automated botanical task delegation workflow with administrative lifecycle status tracking; and (5) Comprehensive analytical dashboards visualizing total canopy coverage, carbon sequestration metrics, and maintenance turnaround efficiency.</w:t>
-      </w:r>
-    </w:p>
-    <w:p>
-      <w:pPr>
-        <w:spacing w:before="0" w:after="120" w:line="360" w:lineRule="auto"/>
-        <w:jc w:val="both"/>
-      </w:pPr>
-      <w:r>
-        <w:rPr>
-          <w:rFonts w:ascii="Times New Roman" w:hAnsi="Times New Roman"/>
-          <w:sz w:val="24"/>
-        </w:rPr>
-        <w:t>Experimental deployment demonstrated sub-120 millisecond API query latency under geospatial indexing, 60 FPS client-side 3D rendering of botanical assets, and a 68% reduction in municipal issue dispatch turnaround times. The system offers municipal governments a scalable, cost-effective framework aligned with United Nations Sustainable Development Goal 11 (Sustainable Cities and Communities).</w:t>
+        <w:t>Performance testing demonstrated sub-120ms API latency, stable 60 FPS client-side 3D rendering, and a 68% reduction in municipal issue dispatch turnaround times. The system delivers an open, scalable, license-free framework supporting United Nations Sustainable Development Goal 11 (Sustainable Cities and Communities).</w:t>
       </w:r>
     </w:p>
     <w:p>
@@ -418,7 +536,7 @@
           <w:rFonts w:ascii="Times New Roman" w:hAnsi="Times New Roman"/>
           <w:sz w:val="24"/>
         </w:rPr>
-        <w:t>Urban Green Spaces, Geographic Information System (GIS), Leaflet, Three.js 3D Digital Twin, MERN Stack, MongoDB Geospatial Indexing, Citizen Science, Urban Forestry.</w:t>
+        <w:t>Urban Green Spaces, Geographic Information System (GIS), Leaflet, Three.js 3D Digital Twin, MERN Stack, Artificial Intelligence, Machine Learning, MongoDB Geospatial Indexing, Citizen Science, Urban Forestry.</w:t>
       </w:r>
     </w:p>
     <w:p>
@@ -450,7 +568,7 @@
           <w:rFonts w:ascii="Times New Roman" w:hAnsi="Times New Roman"/>
           <w:sz w:val="24"/>
         </w:rPr>
-        <w:t>We express our profound and sincere gratitude to our respected Principal, Dr. P. Deiva Sundari, M.E., Ph.D., and the Management of Easwari Engineering College for providing us with state-of-the-art laboratory infrastructure, computational facilities, and a supportive scholarly environment that enabled us to successfully carry out this project work.</w:t>
+        <w:t>I express my profound and sincere gratitude to our respected Principal, Dr. P. Deiva Sundari, M.E., Ph.D., and the Management of Easwari Engineering College for providing state-of-the-art laboratory infrastructure, computational facilities, and a supportive scholarly environment that enabled me to successfully carry out this project work.</w:t>
       </w:r>
     </w:p>
     <w:p>
@@ -463,7 +581,7 @@
           <w:rFonts w:ascii="Times New Roman" w:hAnsi="Times New Roman"/>
           <w:sz w:val="24"/>
         </w:rPr>
-        <w:t>We convey our heartfelt thanks to our Head of the Department, Dr. K. M. Anandkumar, M.E., Ph.D., Department of Computer Science and Engineering, for his constant encouragement, constructive suggestions, and administrative support throughout the development lifecycle of this project.</w:t>
+        <w:t>I convey my heartfelt thanks to our Head of the Department, Dr. K. M. Anandkumar, M.E., Ph.D., Department of Artificial Intelligence and Machine Learning, for his continuous encouragement, constructive suggestions, and administrative support throughout the development lifecycle of this project.</w:t>
       </w:r>
     </w:p>
     <w:p>
@@ -476,7 +594,7 @@
           <w:rFonts w:ascii="Times New Roman" w:hAnsi="Times New Roman"/>
           <w:sz w:val="24"/>
         </w:rPr>
-        <w:t>We are extraordinarily indebted to our esteemed Project Guide, Dr. S. Rajalakshmi, M.E., Ph.D., Associate Professor, Department of Computer Science and Engineering, for her invaluable guidance, intellectual mentorship, painstaking reviews, and inspiring motivation. Her profound expertise in software engineering and web systems significantly elevated the technical rigor of this system.</w:t>
+        <w:t>I am extraordinarily indebted to my esteemed Project Guide, Dr. S. Rajalakshmi, M.E., Ph.D., Associate Professor, Department of Artificial Intelligence and Machine Learning, for her invaluable guidance, intellectual mentorship, painstaking reviews, and inspiring motivation. Her profound expertise in software engineering and intelligent computing significantly elevated the technical rigor of this system.</w:t>
       </w:r>
     </w:p>
     <w:p>
@@ -489,7 +607,7 @@
           <w:rFonts w:ascii="Times New Roman" w:hAnsi="Times New Roman"/>
           <w:sz w:val="24"/>
         </w:rPr>
-        <w:t>We extend our warm gratitude to our Project Coordinators and all the faculty and non-teaching staff members of the Department of Computer Science and Engineering for their direct and indirect assistance, insightful feedback during interim progress reviews, and constant technical cooperation.</w:t>
+        <w:t>I extend my warm gratitude to the Project Coordinators and all the faculty and non-teaching staff members of the Department of Artificial Intelligence and Machine Learning for their direct and indirect assistance, insightful feedback during interim progress reviews, and constant technical cooperation.</w:t>
       </w:r>
     </w:p>
     <w:p>
@@ -502,7 +620,7 @@
           <w:rFonts w:ascii="Times New Roman" w:hAnsi="Times New Roman"/>
           <w:sz w:val="24"/>
         </w:rPr>
-        <w:t>Finally, we express our deepest appreciation and boundless love to our beloved parents, family members, and peers for their unconditional understanding, moral encouragement, sacrifices, and endless support during every phase of our academic journey and this project.</w:t>
+        <w:t>Finally, I express my deepest appreciation and boundless love to my beloved parents, family members, and friends for their unconditional understanding, moral encouragement, sacrifices, and endless support during every phase of my academic journey and this project.</w:t>
       </w:r>
     </w:p>
     <w:p>
@@ -517,9 +635,9 @@
           <w:sz w:val="24"/>
         </w:rPr>
         <w:br/>
-        <w:t>NEGESH K (310621104001)</w:t>
-        <w:br/>
-        <w:t>KUMARAVEL S (310621104002)</w:t>
+        <w:t>NEGESH BALA M</w:t>
+        <w:br/>
+        <w:t>(Reg. No: 310624148062)</w:t>
       </w:r>
     </w:p>
     <w:p>
@@ -3610,7 +3728,7 @@
           <w:rFonts w:ascii="Times New Roman" w:hAnsi="Times New Roman"/>
           <w:sz w:val="24"/>
         </w:rPr>
-        <w:t>API: Application Programming Interface | GIS: Geographic Information System | GCC: Greater Chennai Corporation | JWT: JSON Web Token | MERN: MongoDB, Express, React, Node.js | RBAC: Role-Based Access Control | REST: Representational State Transfer | UHI: Urban Heat Island | WebGL: Web Graphics Library</w:t>
+        <w:t>AIML: Artificial Intelligence &amp; Machine Learning | API: Application Programming Interface | GIS: Geographic Information System | GCC: Greater Chennai Corporation | JWT: JSON Web Token | MERN: MongoDB, Express, React, Node.js | RBAC: Role-Based Access Control | REST: Representational State Transfer | UHI: Urban Heat Island | WebGL: Web Graphics Library</w:t>
       </w:r>
     </w:p>
     <w:p>
@@ -6203,95 +6321,60 @@
     </w:p>
     <w:p>
       <w:pPr>
-        <w:spacing w:before="80" w:after="120" w:line="276" w:lineRule="auto"/>
-        <w:ind w:left="288" w:right="288"/>
-      </w:pPr>
-      <w:r>
-        <w:rPr>
-          <w:rFonts w:ascii="Times New Roman" w:hAnsi="Times New Roman"/>
-          <w:sz w:val="19"/>
-        </w:rPr>
-        <w:br/>
-        <w:t>+-----------------------------------------------------------------------------------+</w:t>
-        <w:br/>
-        <w:t>|                        CLIENT PRESENTATION LAYER (BROWSER)                        |</w:t>
-        <w:br/>
-        <w:t>|  +--------------------+  +----------------------+  +---------------------------+  |</w:t>
-        <w:br/>
-        <w:t>|  | Citizen UI (React) |  | Admin Portal (React) |  | Leaflet GIS Map Container |  |</w:t>
-        <w:br/>
-        <w:t>|  | - Incident Form    |  | - Asset Management   |  | - OpenStreetMap Tiles     |  |</w:t>
-        <w:br/>
-        <w:t>|  | - Park Explorer    |  | - Issue Triage Board |  | - GeoJSON Green Boundary  |  |</w:t>
-        <w:br/>
-        <w:t>|  +--------------------+  +----------------------+  +---------------------------+  |</w:t>
-        <w:br/>
-        <w:t>|                     +---------------------------------------+                     |</w:t>
-        <w:br/>
-        <w:t>|                     | Three.js 3D WebGL Digital Twin Engine |                     |</w:t>
-        <w:br/>
-        <w:t>|                     | - Canvas / Scene / Shaders / Camera   |                     |</w:t>
-        <w:br/>
-        <w:t>|                     +---------------------------------------+                     |</w:t>
-        <w:br/>
-        <w:t>+------------------------------------------+----------------------------------------+</w:t>
-        <w:br/>
-        <w:t xml:space="preserve">                                           | HTTPS / JSON REST API</w:t>
-        <w:br/>
-        <w:t>+------------------------------------------v----------------------------------------+</w:t>
-        <w:br/>
-        <w:t>|                          APPLICATION / BUSINESS LOGIC LAYER                       |</w:t>
-        <w:br/>
-        <w:t>|  +-----------------------------------------------------------------------------+  |</w:t>
-        <w:br/>
-        <w:t>|  |                  Express.js Web Server (Node.js Runtime)                    |  |</w:t>
-        <w:br/>
-        <w:t>|  |  +------------------+  +-------------------+  +--------------------------+  |  |</w:t>
-        <w:br/>
-        <w:t>|  |  | authMiddleware   |  | CORS &amp; BodyParser |  | Global Error Handler     |  |  |</w:t>
-        <w:br/>
-        <w:t>|  |  | (JWT Validation) |  | (Data Sanitizing) |  | (Structured JSON Alerts) |  |  |</w:t>
-        <w:br/>
-        <w:t>|  |  +------------------+  +-------------------+  +--------------------------+  |  |</w:t>
-        <w:br/>
-        <w:t>|  |  +-----------------------------------------------------------------------+  |  |</w:t>
-        <w:br/>
-        <w:t>|  |  | REST Controllers: authController | greenSpaceController               |  |  |</w:t>
-        <w:br/>
-        <w:t>|  |  |                   floraController| issueController                    |  |  |</w:t>
-        <w:br/>
-        <w:t>|  |  +-----------------------------------------------------------------------+  |  |</w:t>
-        <w:br/>
-        <w:t>|  +-----------------------------------------------------------------------------+  |</w:t>
-        <w:br/>
-        <w:t>+------------------------------------------+----------------------------------------+</w:t>
-        <w:br/>
-        <w:t xml:space="preserve">                                           | Mongoose ODM / TCP Socket 27017</w:t>
-        <w:br/>
-        <w:t>+------------------------------------------v----------------------------------------+</w:t>
-        <w:br/>
-        <w:t>|                            DATA PERSISTENCE LAYER                                 |</w:t>
-        <w:br/>
-        <w:t>|  +-----------------------------------------------------------------------------+  |</w:t>
-        <w:br/>
-        <w:t>|  |                     MongoDB Document Database Server                        |  |</w:t>
-        <w:br/>
-        <w:t>|  |  +----------------+  +-------------------+  +------------+  +------------+  |  |</w:t>
-        <w:br/>
-        <w:t>|  |  | Users Collect. |  | GreenSpaces Coll. |  | Flora Coll.|  | Issue Coll.|  |  |</w:t>
-        <w:br/>
-        <w:t>|  |  | (RBAC &amp; Auth)  |  | (GeoJSON Polygons)|  | (3D Params)|  | (Workflows)|  |  |</w:t>
-        <w:br/>
-        <w:t>|  |  +----------------+  +-------------------+  +------------+  +------------+  |  |</w:t>
-        <w:br/>
-        <w:t>|  +-----------------------------------------------------------------------------+  |</w:t>
-        <w:br/>
-        <w:t>+-----------------------------------------------------------------------------------+</w:t>
-        <w:br/>
+        <w:spacing w:before="120" w:after="80"/>
+        <w:jc w:val="center"/>
+      </w:pPr>
+      <w:r>
+        <w:drawing>
+          <wp:inline xmlns:a="http://schemas.openxmlformats.org/drawingml/2006/main" xmlns:pic="http://schemas.openxmlformats.org/drawingml/2006/picture">
+            <wp:extent cx="5303520" cy="3428538"/>
+            <wp:docPr id="4" name="Picture 4"/>
+            <wp:cNvGraphicFramePr>
+              <a:graphicFrameLocks noChangeAspect="1"/>
+            </wp:cNvGraphicFramePr>
+            <a:graphic>
+              <a:graphicData uri="http://schemas.openxmlformats.org/drawingml/2006/picture">
+                <pic:pic>
+                  <pic:nvPicPr>
+                    <pic:cNvPr id="0" name="system_architecture_diagram.png"/>
+                    <pic:cNvPicPr/>
+                  </pic:nvPicPr>
+                  <pic:blipFill>
+                    <a:blip r:embed="rId10"/>
+                    <a:stretch>
+                      <a:fillRect/>
+                    </a:stretch>
+                  </pic:blipFill>
+                  <pic:spPr>
+                    <a:xfrm>
+                      <a:off x="0" y="0"/>
+                      <a:ext cx="5303520" cy="3428538"/>
+                    </a:xfrm>
+                    <a:prstGeom prst="rect"/>
+                  </pic:spPr>
+                </pic:pic>
+              </a:graphicData>
+            </a:graphic>
+          </wp:inline>
+        </w:drawing>
       </w:r>
     </w:p>
     <w:p>
       <w:pPr>
+        <w:spacing w:after="120"/>
+        <w:jc w:val="center"/>
+      </w:pPr>
+      <w:r>
+        <w:rPr>
+          <w:rFonts w:ascii="Times New Roman" w:hAnsi="Times New Roman"/>
+          <w:i/>
+          <w:sz w:val="21"/>
+        </w:rPr>
+        <w:t>Figure 4.1: High-Level 3-Tier System Architecture Diagram</w:t>
+      </w:r>
+    </w:p>
+    <w:p>
+      <w:pPr>
         <w:spacing w:before="0" w:after="120" w:line="360" w:lineRule="auto"/>
         <w:jc w:val="both"/>
       </w:pPr>
@@ -6300,7 +6383,7 @@
           <w:rFonts w:ascii="Times New Roman" w:hAnsi="Times New Roman"/>
           <w:sz w:val="24"/>
         </w:rPr>
-        <w:t>This separation of concerns guarantees that changes in the client presentation layer (e.g., updating 3D shaders or adding mobile views) do not affect underlying database queries or business authentication logic.</w:t>
+        <w:t>This architectural paradigm establishes a clean separation of concerns: the Presentation Tier (React 18, Three.js 3D WebGL, Leaflet GIS) executes entirely on the client browser; the Application Tier (Express.js, Node.js) enforces security and business rules; while the Data Tier (MongoDB v8.2.6) provides durable geospatial document persistence.</w:t>
       </w:r>
     </w:p>
     <w:p>
@@ -7039,77 +7122,56 @@
     </w:p>
     <w:p>
       <w:pPr>
-        <w:spacing w:before="80" w:after="120" w:line="276" w:lineRule="auto"/>
-        <w:ind w:left="288" w:right="288"/>
-      </w:pPr>
-      <w:r>
-        <w:rPr>
-          <w:rFonts w:ascii="Times New Roman" w:hAnsi="Times New Roman"/>
-          <w:sz w:val="19"/>
-        </w:rPr>
-        <w:br/>
-        <w:t>+------------------------------------+             +------------------------------------+</w:t>
-        <w:br/>
-        <w:t>|               User                 |             |             GreenSpace             |</w:t>
-        <w:br/>
-        <w:t>+------------------------------------+             +------------------------------------+</w:t>
-        <w:br/>
-        <w:t>| - _id: ObjectId                    |             | - _id: ObjectId                    |</w:t>
-        <w:br/>
-        <w:t>| - name: String                     |             | - name: String                     |</w:t>
-        <w:br/>
-        <w:t>| - email: String                    | 1         * | - type: String                     |</w:t>
-        <w:br/>
-        <w:t>| - passwordHash: String             |------------&gt;| - areaSquareMeters: Number         |</w:t>
-        <w:br/>
-        <w:t>| - role: String                     | manages     | - location: GeoJSON                |</w:t>
-        <w:br/>
-        <w:t>| - createdAt: Date                  |             | - facilities: Array&lt;String&gt;        |</w:t>
-        <w:br/>
-        <w:t>+------------------------------------+             +------------------------------------+</w:t>
-        <w:br/>
-        <w:t>| + register(): Promise&lt;Token&gt;       |             | + calculateCanopyDensity(): Number |</w:t>
-        <w:br/>
-        <w:t>| + comparePassword(): Boolean       |             | + getNearbyGreenSpaces(): Array    |</w:t>
-        <w:br/>
-        <w:t>+------------------------------------+             +------------------------------------+</w:t>
-        <w:br/>
-        <w:t xml:space="preserve">                  | 1                                                 | 1</w:t>
-        <w:br/>
-        <w:t xml:space="preserve">                  |                                                   |</w:t>
-        <w:br/>
-        <w:t xml:space="preserve">                  | reports *                                         | contains *</w:t>
-        <w:br/>
-        <w:t xml:space="preserve">                  v                                                   v</w:t>
-        <w:br/>
-        <w:t>+------------------------------------+             +------------------------------------+</w:t>
-        <w:br/>
-        <w:t>|               Issue                |             |               Flora                |</w:t>
-        <w:br/>
-        <w:t>+------------------------------------+             +------------------------------------+</w:t>
-        <w:br/>
-        <w:t>| - _id: ObjectId                    |             | - _id: ObjectId                    |</w:t>
-        <w:br/>
-        <w:t>| - title: String                    |             | - commonName: String               |</w:t>
-        <w:br/>
-        <w:t>| - description: String              |             | - scientificName: String           |</w:t>
-        <w:br/>
-        <w:t>| - category: String                 |             | - healthStatus: String             |</w:t>
-        <w:br/>
-        <w:t>| - status: String                   |             | - heightMeters: Number             |</w:t>
-        <w:br/>
-        <w:t>| - reportedBy: ObjectId (User)      |             | - crownDiameter: Number            |</w:t>
-        <w:br/>
-        <w:t>| - greenSpaceId: ObjectId           |             | - canopyColor: String              |</w:t>
-        <w:br/>
-        <w:t>+------------------------------------+             +------------------------------------+</w:t>
-        <w:br/>
-        <w:t>| + updateStatus(newStatus): Void    |             | + render3DDigitalTwin(): Canvas    |</w:t>
-        <w:br/>
-        <w:t>| + addAdminNote(note): Void         |             | + calculateBiomass(): Number       |</w:t>
-        <w:br/>
-        <w:t>+------------------------------------+             +------------------------------------+</w:t>
-        <w:br/>
+        <w:spacing w:before="120" w:after="80"/>
+        <w:jc w:val="center"/>
+      </w:pPr>
+      <w:r>
+        <w:drawing>
+          <wp:inline xmlns:a="http://schemas.openxmlformats.org/drawingml/2006/main" xmlns:pic="http://schemas.openxmlformats.org/drawingml/2006/picture">
+            <wp:extent cx="5303520" cy="3428538"/>
+            <wp:docPr id="5" name="Picture 5"/>
+            <wp:cNvGraphicFramePr>
+              <a:graphicFrameLocks noChangeAspect="1"/>
+            </wp:cNvGraphicFramePr>
+            <a:graphic>
+              <a:graphicData uri="http://schemas.openxmlformats.org/drawingml/2006/picture">
+                <pic:pic>
+                  <pic:nvPicPr>
+                    <pic:cNvPr id="0" name="uml_class_diagram.png"/>
+                    <pic:cNvPicPr/>
+                  </pic:nvPicPr>
+                  <pic:blipFill>
+                    <a:blip r:embed="rId11"/>
+                    <a:stretch>
+                      <a:fillRect/>
+                    </a:stretch>
+                  </pic:blipFill>
+                  <pic:spPr>
+                    <a:xfrm>
+                      <a:off x="0" y="0"/>
+                      <a:ext cx="5303520" cy="3428538"/>
+                    </a:xfrm>
+                    <a:prstGeom prst="rect"/>
+                  </pic:spPr>
+                </pic:pic>
+              </a:graphicData>
+            </a:graphic>
+          </wp:inline>
+        </w:drawing>
+      </w:r>
+    </w:p>
+    <w:p>
+      <w:pPr>
+        <w:spacing w:after="120"/>
+        <w:jc w:val="center"/>
+      </w:pPr>
+      <w:r>
+        <w:rPr>
+          <w:rFonts w:ascii="Times New Roman" w:hAnsi="Times New Roman"/>
+          <w:i/>
+          <w:sz w:val="21"/>
+        </w:rPr>
+        <w:t>Figure 4.5: UML Class Diagram &amp; Entity Relationships</w:t>
       </w:r>
     </w:p>
     <w:p>
@@ -7160,69 +7222,69 @@
     </w:p>
     <w:p>
       <w:pPr>
-        <w:spacing w:before="80" w:after="120" w:line="276" w:lineRule="auto"/>
-        <w:ind w:left="288" w:right="288"/>
-      </w:pPr>
-      <w:r>
-        <w:rPr>
-          <w:rFonts w:ascii="Times New Roman" w:hAnsi="Times New Roman"/>
-          <w:sz w:val="19"/>
-        </w:rPr>
-        <w:br/>
-        <w:t>Citizen Browser        React App          Express Gateway        IssueController      MongoDB Store</w:t>
-        <w:br/>
-        <w:t xml:space="preserve">      |                    |                     |                      |                   |</w:t>
-        <w:br/>
-        <w:t xml:space="preserve">      |-- 1. Fill Form ---&gt;|                     |                      |                   |</w:t>
-        <w:br/>
-        <w:t xml:space="preserve">      |   &amp; Attach Photo   |                     |                      |                   |</w:t>
-        <w:br/>
-        <w:t xml:space="preserve">      |                    |-- 2. POST /api/issue|                      |                   |</w:t>
-        <w:br/>
-        <w:t xml:space="preserve">      |                    |      (Payload + JWT)|                      |                   |</w:t>
-        <w:br/>
-        <w:t xml:space="preserve">      |                    |--------------------&gt;|                      |                   |</w:t>
-        <w:br/>
-        <w:t xml:space="preserve">      |                    |                     |-- 3. Verify Token --&gt;|                   |</w:t>
-        <w:br/>
-        <w:t xml:space="preserve">      |                    |                     |      &amp; Sanitize      |                   |</w:t>
-        <w:br/>
-        <w:t xml:space="preserve">      |                    |                     |---------------------&gt;|                   |</w:t>
-        <w:br/>
-        <w:t xml:space="preserve">      |                    |                     |                      |-- 4. save() -----&gt;|</w:t>
-        <w:br/>
-        <w:t xml:space="preserve">      |                    |                     |                      |                   |</w:t>
-        <w:br/>
-        <w:t xml:space="preserve">      |                    |                     |                      |&lt;-- 5. Doc Created |</w:t>
-        <w:br/>
-        <w:t xml:space="preserve">      |                    |                     |&lt;-- 6. HTTP 201 Created-------------------|</w:t>
-        <w:br/>
-        <w:t xml:space="preserve">      |                    |&lt;-- 7. Success Banner|                      |                   |</w:t>
-        <w:br/>
-        <w:t xml:space="preserve">      |&lt;-- 8. Visual Toast-|                     |                      |                   |</w:t>
-        <w:br/>
-        <w:t xml:space="preserve">      |                    |                     |                      |                   |</w:t>
-        <w:br/>
-        <w:t>Admin Browser              |                     |                      |                   |</w:t>
-        <w:br/>
-        <w:t xml:space="preserve">      |                    |                     |                      |                   |</w:t>
-        <w:br/>
-        <w:t xml:space="preserve">      |-- 9. Fetch Issues ----------------------&gt;|                      |                   |</w:t>
-        <w:br/>
-        <w:t xml:space="preserve">      |                    |                     |-- 10. find() -------&gt;|                   |</w:t>
-        <w:br/>
-        <w:t xml:space="preserve">      |                    |                     |&lt;-- 11. Issue List ---|                   |</w:t>
-        <w:br/>
-        <w:t xml:space="preserve">      |&lt;-- 12. Render Triage Table --------------|                      |                   |</w:t>
-        <w:br/>
-        <w:t xml:space="preserve">      |                    |                     |                      |                   |</w:t>
-        <w:br/>
-        <w:t xml:space="preserve">      |-- 13. PATCH /api/issues/:id/status -----&gt;|                      |                   |</w:t>
-        <w:br/>
-        <w:t xml:space="preserve">      |       { status: 'Resolved' }             |-- 14. findByIdAndUpdate() --------------&gt;|</w:t>
-        <w:br/>
-        <w:t xml:space="preserve">      |&lt;-- 15. Status Updated Successfully ------|&lt;-----------------------------------------|</w:t>
-        <w:br/>
+        <w:spacing w:before="120" w:after="80"/>
+        <w:jc w:val="center"/>
+      </w:pPr>
+      <w:r>
+        <w:drawing>
+          <wp:inline xmlns:a="http://schemas.openxmlformats.org/drawingml/2006/main" xmlns:pic="http://schemas.openxmlformats.org/drawingml/2006/picture">
+            <wp:extent cx="5303520" cy="3428538"/>
+            <wp:docPr id="6" name="Picture 6"/>
+            <wp:cNvGraphicFramePr>
+              <a:graphicFrameLocks noChangeAspect="1"/>
+            </wp:cNvGraphicFramePr>
+            <a:graphic>
+              <a:graphicData uri="http://schemas.openxmlformats.org/drawingml/2006/picture">
+                <pic:pic>
+                  <pic:nvPicPr>
+                    <pic:cNvPr id="0" name="uml_sequence_diagram.png"/>
+                    <pic:cNvPicPr/>
+                  </pic:nvPicPr>
+                  <pic:blipFill>
+                    <a:blip r:embed="rId12"/>
+                    <a:stretch>
+                      <a:fillRect/>
+                    </a:stretch>
+                  </pic:blipFill>
+                  <pic:spPr>
+                    <a:xfrm>
+                      <a:off x="0" y="0"/>
+                      <a:ext cx="5303520" cy="3428538"/>
+                    </a:xfrm>
+                    <a:prstGeom prst="rect"/>
+                  </pic:spPr>
+                </pic:pic>
+              </a:graphicData>
+            </a:graphic>
+          </wp:inline>
+        </w:drawing>
+      </w:r>
+    </w:p>
+    <w:p>
+      <w:pPr>
+        <w:spacing w:after="120"/>
+        <w:jc w:val="center"/>
+      </w:pPr>
+      <w:r>
+        <w:rPr>
+          <w:rFonts w:ascii="Times New Roman" w:hAnsi="Times New Roman"/>
+          <w:i/>
+          <w:sz w:val="21"/>
+        </w:rPr>
+        <w:t>Figure 4.6: UML Sequence Diagram: Incident Reporting &amp; Dispatch</w:t>
+      </w:r>
+    </w:p>
+    <w:p>
+      <w:pPr>
+        <w:spacing w:before="0" w:after="120" w:line="360" w:lineRule="auto"/>
+        <w:jc w:val="both"/>
+      </w:pPr>
+      <w:r>
+        <w:rPr>
+          <w:rFonts w:ascii="Times New Roman" w:hAnsi="Times New Roman"/>
+          <w:sz w:val="24"/>
+        </w:rPr>
+        <w:t>The sequence documents: (1) Client attaches photo and GPS coordinates; (2) Express Gateway validates token; (3) Controller commits document to MongoDB; (4) Admin receives alert and dispatches maintenance crew.</w:t>
       </w:r>
     </w:p>
     <w:p>
@@ -9345,7 +9407,7 @@
           </w:tcPr>
           <w:p>
             <w:r>
-              <w:t>NoSQL payload `{ $gt: '' }` in login email</w:t>
+              <w:t>NoSQL payload in login email</w:t>
             </w:r>
           </w:p>
         </w:tc>
@@ -10163,93 +10225,93 @@
         <w:br/>
         <w:t>mern-urban-green-management/</w:t>
         <w:br/>
-        <w:t>│</w:t>
-        <w:br/>
-        <w:t>├── server/                                # Backend Node.js / Express Server</w:t>
-        <w:br/>
-        <w:t>│   ├── config/</w:t>
-        <w:br/>
-        <w:t>│   │   └── db.js                          # MongoDB Mongoose Connection Engine</w:t>
-        <w:br/>
-        <w:t>│   ├── controllers/</w:t>
-        <w:br/>
-        <w:t>│   │   ├── authController.js              # User Registration, Login &amp; Session Logic</w:t>
-        <w:br/>
-        <w:t>│   │   ├── greenSpaceController.js        # Park &amp; GIS Boundary Management Logic</w:t>
-        <w:br/>
-        <w:t>│   │   ├── floraController.js             # Tree Cataloguing &amp; Health Logic</w:t>
-        <w:br/>
-        <w:t>│   │   └── issueController.js             # Citizen Incident Triage &amp; Reporting Logic</w:t>
-        <w:br/>
-        <w:t>│   ├── middleware/</w:t>
-        <w:br/>
-        <w:t>│   │   └── authMiddleware.js              # JWT Verification &amp; Role Authorization (RBAC)</w:t>
-        <w:br/>
-        <w:t>│   ├── models/</w:t>
-        <w:br/>
-        <w:t>│   │   ├── User.js                        # User Authentication &amp; Role Schema</w:t>
-        <w:br/>
-        <w:t>│   │   ├── GreenSpace.js                  # Park &amp; GeoJSON Boundary Schema</w:t>
-        <w:br/>
-        <w:t>│   │   ├── Flora.js                       # Botanical Asset &amp; 3D Parameters Schema</w:t>
-        <w:br/>
-        <w:t>│   │   └── Issue.js                       # Environmental Incident Report Schema</w:t>
-        <w:br/>
-        <w:t>│   ├── routes/</w:t>
-        <w:br/>
-        <w:t>│   │   ├── authRoutes.js                  # Authentication Route Endpoints</w:t>
-        <w:br/>
-        <w:t>│   │   ├── greenSpaceRoutes.js            # Green Space REST Endpoints</w:t>
-        <w:br/>
-        <w:t>│   │   ├── floraRoutes.js                 # Flora REST Endpoints</w:t>
-        <w:br/>
-        <w:t>│   │   └── issueRoutes.js                 # Incident Report REST Endpoints</w:t>
-        <w:br/>
-        <w:t>│   ├── .env                               # Environment Configuration &amp; Secrets</w:t>
-        <w:br/>
-        <w:t>│   ├── package.json                       # Backend Dependencies &amp; Run Scripts</w:t>
-        <w:br/>
-        <w:t>│   └── server.js                          # Express Application Entrypoint</w:t>
-        <w:br/>
-        <w:t>│</w:t>
-        <w:br/>
-        <w:t>└── client/                                # Frontend React 18 Single-Page Application</w:t>
-        <w:br/>
-        <w:t xml:space="preserve">    ├── src/</w:t>
-        <w:br/>
-        <w:t xml:space="preserve">    │   ├── components/</w:t>
-        <w:br/>
-        <w:t xml:space="preserve">    │   │   ├── FloraVisualizer3D.jsx      # Three.js 3D WebGL Digital Twin Component</w:t>
-        <w:br/>
-        <w:t xml:space="preserve">    │   │   ├── GreenMap.jsx               # Leaflet Interactive GIS Map Component</w:t>
-        <w:br/>
-        <w:t xml:space="preserve">    │   │   ├── Navbar.jsx                 # Responsive Navigation Header</w:t>
-        <w:br/>
-        <w:t xml:space="preserve">    │   │   └── ProtectedRoute.jsx         # Client-Side RBAC Route Guard</w:t>
-        <w:br/>
-        <w:t xml:space="preserve">    │   ├── pages/</w:t>
-        <w:br/>
-        <w:t xml:space="preserve">    │   │   ├── Login.jsx                  # User Authentication Portal</w:t>
-        <w:br/>
-        <w:t xml:space="preserve">    │   │   ├── Register.jsx               # User Onboarding Portal</w:t>
-        <w:br/>
-        <w:t xml:space="preserve">    │   │   ├── AdminDashboard.jsx         # Municipal Command &amp; Control Center</w:t>
-        <w:br/>
-        <w:t xml:space="preserve">    │   │   └── CitizenDashboard.jsx       # Citizen Environmental Engagement View</w:t>
-        <w:br/>
-        <w:t xml:space="preserve">    │   ├── services/</w:t>
-        <w:br/>
-        <w:t xml:space="preserve">    │   │   └── api.js                     # Axios HTTP Client Configuration</w:t>
-        <w:br/>
-        <w:t xml:space="preserve">    │   ├── App.jsx                        # Main Application Routing Tree</w:t>
-        <w:br/>
-        <w:t xml:space="preserve">    │   ├── index.css                      # Global Design System &amp; Variables</w:t>
-        <w:br/>
-        <w:t xml:space="preserve">    │   └── main.jsx                       # React DOM Root Entrypoint</w:t>
-        <w:br/>
-        <w:t xml:space="preserve">    ├── package.json                       # Frontend Dependencies</w:t>
-        <w:br/>
-        <w:t xml:space="preserve">    └── vite.config.js                     # Vite Bundler &amp; Dev Server Config</w:t>
+        <w:t>|</w:t>
+        <w:br/>
+        <w:t>+-- server/                                # Backend Node.js / Express Server</w:t>
+        <w:br/>
+        <w:t>|   +-- config/</w:t>
+        <w:br/>
+        <w:t>|   |   +-- db.js                          # MongoDB Mongoose Connection Engine</w:t>
+        <w:br/>
+        <w:t>|   +-- controllers/</w:t>
+        <w:br/>
+        <w:t>|   |   +-- authController.js              # User Registration, Login &amp; Session Logic</w:t>
+        <w:br/>
+        <w:t>|   |   +-- greenSpaceController.js        # Park &amp; GIS Boundary Management Logic</w:t>
+        <w:br/>
+        <w:t>|   |   +-- floraController.js             # Tree Cataloguing &amp; Health Logic</w:t>
+        <w:br/>
+        <w:t>|   |   +-- issueController.js             # Citizen Incident Triage &amp; Reporting Logic</w:t>
+        <w:br/>
+        <w:t>|   +-- middleware/</w:t>
+        <w:br/>
+        <w:t>|   |   +-- authMiddleware.js              # JWT Verification &amp; Role Authorization (RBAC)</w:t>
+        <w:br/>
+        <w:t>|   +-- models/</w:t>
+        <w:br/>
+        <w:t>|   |   +-- User.js                        # User Authentication &amp; Role Schema</w:t>
+        <w:br/>
+        <w:t>|   |   +-- GreenSpace.js                  # Park &amp; GeoJSON Boundary Schema</w:t>
+        <w:br/>
+        <w:t>|   |   +-- Flora.js                       # Botanical Asset &amp; 3D Parameters Schema</w:t>
+        <w:br/>
+        <w:t>|   |   +-- Issue.js                       # Environmental Incident Report Schema</w:t>
+        <w:br/>
+        <w:t>|   +-- routes/</w:t>
+        <w:br/>
+        <w:t>|   |   +-- authRoutes.js                  # Authentication Route Endpoints</w:t>
+        <w:br/>
+        <w:t>|   |   +-- greenSpaceRoutes.js            # Green Space REST Endpoints</w:t>
+        <w:br/>
+        <w:t>|   |   +-- floraRoutes.js                 # Flora REST Endpoints</w:t>
+        <w:br/>
+        <w:t>|   |   +-- issueRoutes.js                 # Incident Report REST Endpoints</w:t>
+        <w:br/>
+        <w:t>|   +-- .env                               # Environment Configuration &amp; Secrets</w:t>
+        <w:br/>
+        <w:t>|   +-- package.json                       # Backend Dependencies &amp; Run Scripts</w:t>
+        <w:br/>
+        <w:t>|   +-- server.js                          # Express Application Entrypoint</w:t>
+        <w:br/>
+        <w:t>|</w:t>
+        <w:br/>
+        <w:t>+-- client/                                # Frontend React 18 Single-Page Application</w:t>
+        <w:br/>
+        <w:t xml:space="preserve">    +-- src/</w:t>
+        <w:br/>
+        <w:t xml:space="preserve">    |   +-- components/</w:t>
+        <w:br/>
+        <w:t xml:space="preserve">    |   |   +-- FloraVisualizer3D.jsx      # Three.js 3D WebGL Digital Twin Component</w:t>
+        <w:br/>
+        <w:t xml:space="preserve">    |   |   +-- GreenMap.jsx               # Leaflet Interactive GIS Map Component</w:t>
+        <w:br/>
+        <w:t xml:space="preserve">    |   |   +-- Navbar.jsx                 # Responsive Navigation Header</w:t>
+        <w:br/>
+        <w:t xml:space="preserve">    |   |   +-- ProtectedRoute.jsx         # Client-Side RBAC Route Guard</w:t>
+        <w:br/>
+        <w:t xml:space="preserve">    |   +-- pages/</w:t>
+        <w:br/>
+        <w:t xml:space="preserve">    |   |   +-- Login.jsx                  # User Authentication Portal</w:t>
+        <w:br/>
+        <w:t xml:space="preserve">    |   |   +-- Register.jsx               # User Onboarding Portal</w:t>
+        <w:br/>
+        <w:t xml:space="preserve">    |   |   +-- AdminDashboard.jsx         # Municipal Command &amp; Control Center</w:t>
+        <w:br/>
+        <w:t xml:space="preserve">    |   |   +-- CitizenDashboard.jsx       # Citizen Environmental Engagement View</w:t>
+        <w:br/>
+        <w:t xml:space="preserve">    |   +-- services/</w:t>
+        <w:br/>
+        <w:t xml:space="preserve">    |   |   +-- api.js                     # Axios HTTP Client Configuration</w:t>
+        <w:br/>
+        <w:t xml:space="preserve">    |   +-- App.jsx                        # Main Application Routing Tree</w:t>
+        <w:br/>
+        <w:t xml:space="preserve">    |   +-- index.css                      # Global Design System &amp; Variables</w:t>
+        <w:br/>
+        <w:t xml:space="preserve">    |   +-- main.jsx                       # React DOM Root Entrypoint</w:t>
+        <w:br/>
+        <w:t xml:space="preserve">    +-- package.json                       # Frontend Dependencies</w:t>
+        <w:br/>
+        <w:t xml:space="preserve">    +-- vite.config.js                     # Vite Bundler &amp; Dev Server Config</w:t>
         <w:br/>
       </w:r>
     </w:p>
@@ -11605,7 +11667,7 @@
     </w:p>
     <w:p>
       <w:pPr>
-        <w:spacing w:before="400" w:after="400" w:line="288" w:lineRule="auto"/>
+        <w:spacing w:before="200" w:after="240" w:line="288" w:lineRule="auto"/>
         <w:jc w:val="center"/>
       </w:pPr>
       <w:r>
@@ -11634,15 +11696,56 @@
     </w:p>
     <w:p>
       <w:pPr>
-        <w:spacing w:before="0" w:after="120" w:line="360" w:lineRule="auto"/>
-        <w:jc w:val="both"/>
-      </w:pPr>
-      <w:r>
-        <w:rPr>
-          <w:rFonts w:ascii="Times New Roman" w:hAnsi="Times New Roman"/>
-          <w:sz w:val="24"/>
-        </w:rPr>
-        <w:t>The system provides dedicated dual interfaces: (1) Administrative Command Center displaying live GIS layers, park inventory statistics, and incident triage queues; (2) Citizen Environmental Portal featuring Leaflet map navigation, interactive Three.js 3D tree digital twins, and a rapid incident logging form with GPS capture.</w:t>
+        <w:spacing w:before="120" w:after="80"/>
+        <w:jc w:val="center"/>
+      </w:pPr>
+      <w:r>
+        <w:drawing>
+          <wp:inline xmlns:a="http://schemas.openxmlformats.org/drawingml/2006/main" xmlns:pic="http://schemas.openxmlformats.org/drawingml/2006/picture">
+            <wp:extent cx="4389120" cy="2318861"/>
+            <wp:docPr id="7" name="Picture 7"/>
+            <wp:cNvGraphicFramePr>
+              <a:graphicFrameLocks noChangeAspect="1"/>
+            </wp:cNvGraphicFramePr>
+            <a:graphic>
+              <a:graphicData uri="http://schemas.openxmlformats.org/drawingml/2006/picture">
+                <pic:pic>
+                  <pic:nvPicPr>
+                    <pic:cNvPr id="0" name="screenshot_citizen_3d_portal.png"/>
+                    <pic:cNvPicPr/>
+                  </pic:nvPicPr>
+                  <pic:blipFill>
+                    <a:blip r:embed="rId13"/>
+                    <a:stretch>
+                      <a:fillRect/>
+                    </a:stretch>
+                  </pic:blipFill>
+                  <pic:spPr>
+                    <a:xfrm>
+                      <a:off x="0" y="0"/>
+                      <a:ext cx="4389120" cy="2318861"/>
+                    </a:xfrm>
+                    <a:prstGeom prst="rect"/>
+                  </pic:spPr>
+                </pic:pic>
+              </a:graphicData>
+            </a:graphic>
+          </wp:inline>
+        </w:drawing>
+      </w:r>
+    </w:p>
+    <w:p>
+      <w:pPr>
+        <w:spacing w:after="120"/>
+        <w:jc w:val="center"/>
+      </w:pPr>
+      <w:r>
+        <w:rPr>
+          <w:rFonts w:ascii="Times New Roman" w:hAnsi="Times New Roman"/>
+          <w:i/>
+          <w:sz w:val="21"/>
+        </w:rPr>
+        <w:t>Figure App.1: Citizen Interactive Portal with Leaflet GIS Map &amp; Three.js 3D Twin</w:t>
       </w:r>
     </w:p>
     <w:p>
@@ -11662,132 +11765,132 @@
     </w:p>
     <w:p>
       <w:pPr>
-        <w:spacing w:after="80" w:line="288" w:lineRule="auto"/>
-        <w:ind w:left="432"/>
-      </w:pPr>
-      <w:r>
-        <w:rPr>
-          <w:rFonts w:ascii="Times New Roman" w:hAnsi="Times New Roman"/>
-          <w:sz w:val="22"/>
-        </w:rPr>
-        <w:t>[1] D. J. Nowak, S. Hirabayashi, A. Bodine, and R. Hoehn, 'Modeled carbon storage and air pollution removal by urban trees in the United States,' Environmental Pollution, vol. 178, pp. 229–236, 2013.</w:t>
+        <w:spacing w:after="50" w:line="276" w:lineRule="auto"/>
+        <w:ind w:left="288"/>
+      </w:pPr>
+      <w:r>
+        <w:rPr>
+          <w:rFonts w:ascii="Times New Roman" w:hAnsi="Times New Roman"/>
+          <w:sz w:val="19"/>
+        </w:rPr>
+        <w:t>[1] D. J. Nowak et al., 'Modeled carbon storage and air pollution removal by urban trees in the United States,' Environmental Pollution, vol. 178, pp. 229-236, 2013.</w:t>
       </w:r>
     </w:p>
     <w:p>
       <w:pPr>
-        <w:spacing w:after="80" w:line="288" w:lineRule="auto"/>
-        <w:ind w:left="432"/>
-      </w:pPr>
-      <w:r>
-        <w:rPr>
-          <w:rFonts w:ascii="Times New Roman" w:hAnsi="Times New Roman"/>
-          <w:sz w:val="22"/>
-        </w:rPr>
-        <w:t>[2] E. G. McPherson, Q. Xiao, and J. R. Simpson, 'Urban forest biomass and carbon storage in North American cities,' Urban Forestry &amp; Urban Greening, vol. 18, pp. 24–33, 2016.</w:t>
+        <w:spacing w:after="50" w:line="276" w:lineRule="auto"/>
+        <w:ind w:left="288"/>
+      </w:pPr>
+      <w:r>
+        <w:rPr>
+          <w:rFonts w:ascii="Times New Roman" w:hAnsi="Times New Roman"/>
+          <w:sz w:val="19"/>
+        </w:rPr>
+        <w:t>[2] E. G. McPherson et al., 'Urban forest biomass and carbon storage in North American cities,' Urban Forestry &amp; Urban Greening, vol. 18, pp. 24-33, 2016.</w:t>
       </w:r>
     </w:p>
     <w:p>
       <w:pPr>
-        <w:spacing w:after="80" w:line="288" w:lineRule="auto"/>
-        <w:ind w:left="432"/>
-      </w:pPr>
-      <w:r>
-        <w:rPr>
-          <w:rFonts w:ascii="Times New Roman" w:hAnsi="Times New Roman"/>
-          <w:sz w:val="22"/>
-        </w:rPr>
-        <w:t>[3] M. F. Goodchild, 'Citizens as sensors: the world of volunteered geography,' GeoJournal, vol. 69, no. 4, pp. 211–221, 2007.</w:t>
+        <w:spacing w:after="50" w:line="276" w:lineRule="auto"/>
+        <w:ind w:left="288"/>
+      </w:pPr>
+      <w:r>
+        <w:rPr>
+          <w:rFonts w:ascii="Times New Roman" w:hAnsi="Times New Roman"/>
+          <w:sz w:val="19"/>
+        </w:rPr>
+        <w:t>[3] M. F. Goodchild, 'Citizens as sensors: the world of volunteered geography,' GeoJournal, vol. 69, no. 4, pp. 211-221, 2007.</w:t>
       </w:r>
     </w:p>
     <w:p>
       <w:pPr>
-        <w:spacing w:after="80" w:line="288" w:lineRule="auto"/>
-        <w:ind w:left="432"/>
-      </w:pPr>
-      <w:r>
-        <w:rPr>
-          <w:rFonts w:ascii="Times New Roman" w:hAnsi="Times New Roman"/>
-          <w:sz w:val="22"/>
-        </w:rPr>
-        <w:t>[4] L. A. Roman et al., 'Data, classifications, and demographics of urban street tree survival,' Urban Forestry &amp; Urban Greening, vol. 22, pp. 124–137, 2017.</w:t>
+        <w:spacing w:after="50" w:line="276" w:lineRule="auto"/>
+        <w:ind w:left="288"/>
+      </w:pPr>
+      <w:r>
+        <w:rPr>
+          <w:rFonts w:ascii="Times New Roman" w:hAnsi="Times New Roman"/>
+          <w:sz w:val="19"/>
+        </w:rPr>
+        <w:t>[4] L. A. Roman et al., 'Data, classifications, and demographics of urban street tree survival,' Urban Forestry &amp; Urban Greening, vol. 22, pp. 124-137, 2017.</w:t>
       </w:r>
     </w:p>
     <w:p>
       <w:pPr>
-        <w:spacing w:after="80" w:line="288" w:lineRule="auto"/>
-        <w:ind w:left="432"/>
-      </w:pPr>
-      <w:r>
-        <w:rPr>
-          <w:rFonts w:ascii="Times New Roman" w:hAnsi="Times New Roman"/>
-          <w:sz w:val="22"/>
-        </w:rPr>
-        <w:t>[5] P. Cabral et al., 'WebGL-based digital twin architectures for environmental urban asset modeling,' Computers, Environment and Urban Systems, vol. 84, p. 101538, 2020.</w:t>
+        <w:spacing w:after="50" w:line="276" w:lineRule="auto"/>
+        <w:ind w:left="288"/>
+      </w:pPr>
+      <w:r>
+        <w:rPr>
+          <w:rFonts w:ascii="Times New Roman" w:hAnsi="Times New Roman"/>
+          <w:sz w:val="19"/>
+        </w:rPr>
+        <w:t>[5] P. Cabral et al., 'WebGL-based digital twin architectures for environmental urban asset modeling,' Comput. Environ. Urban Syst., vol. 84, p. 101538, 2020.</w:t>
       </w:r>
     </w:p>
     <w:p>
       <w:pPr>
-        <w:spacing w:after="80" w:line="288" w:lineRule="auto"/>
-        <w:ind w:left="432"/>
-      </w:pPr>
-      <w:r>
-        <w:rPr>
-          <w:rFonts w:ascii="Times New Roman" w:hAnsi="Times New Roman"/>
-          <w:sz w:val="22"/>
-        </w:rPr>
-        <w:t>[6] J. S. V. Leaflet Development Team, 'Leaflet: An open-source JavaScript library for mobile-friendly interactive maps,' https://leafletjs.com, 2025.</w:t>
+        <w:spacing w:after="50" w:line="276" w:lineRule="auto"/>
+        <w:ind w:left="288"/>
+      </w:pPr>
+      <w:r>
+        <w:rPr>
+          <w:rFonts w:ascii="Times New Roman" w:hAnsi="Times New Roman"/>
+          <w:sz w:val="19"/>
+        </w:rPr>
+        <w:t>[6] J. S. V. Leaflet Development Team, 'Leaflet: An open-source JavaScript library for interactive maps,' https://leafletjs.com, 2025.</w:t>
       </w:r>
     </w:p>
     <w:p>
       <w:pPr>
-        <w:spacing w:after="80" w:line="288" w:lineRule="auto"/>
-        <w:ind w:left="432"/>
-      </w:pPr>
-      <w:r>
-        <w:rPr>
-          <w:rFonts w:ascii="Times New Roman" w:hAnsi="Times New Roman"/>
-          <w:sz w:val="22"/>
-        </w:rPr>
-        <w:t>[7] M. Cabello and Three.js Contributors, 'Three.js: JavaScript 3D Library based on WebGL,' https://threejs.org, 2025.</w:t>
+        <w:spacing w:after="50" w:line="276" w:lineRule="auto"/>
+        <w:ind w:left="288"/>
+      </w:pPr>
+      <w:r>
+        <w:rPr>
+          <w:rFonts w:ascii="Times New Roman" w:hAnsi="Times New Roman"/>
+          <w:sz w:val="19"/>
+        </w:rPr>
+        <w:t>[7] M. Cabello and Three.js Contributors, 'Three.js: JavaScript 3D WebGL Library,' https://threejs.org, 2025.</w:t>
       </w:r>
     </w:p>
     <w:p>
       <w:pPr>
-        <w:spacing w:after="80" w:line="288" w:lineRule="auto"/>
-        <w:ind w:left="432"/>
-      </w:pPr>
-      <w:r>
-        <w:rPr>
-          <w:rFonts w:ascii="Times New Roman" w:hAnsi="Times New Roman"/>
-          <w:sz w:val="22"/>
-        </w:rPr>
-        <w:t>[8] MongoDB Inc., 'MongoDB Geospatial 2dsphere Indexes and GeoJSON Queries Manual,' MongoDB Documentation, 2025.</w:t>
+        <w:spacing w:after="50" w:line="276" w:lineRule="auto"/>
+        <w:ind w:left="288"/>
+      </w:pPr>
+      <w:r>
+        <w:rPr>
+          <w:rFonts w:ascii="Times New Roman" w:hAnsi="Times New Roman"/>
+          <w:sz w:val="19"/>
+        </w:rPr>
+        <w:t>[8] MongoDB Inc., 'MongoDB Geospatial 2dsphere Indexes and GeoJSON Queries Manual,' 2025.</w:t>
       </w:r>
     </w:p>
     <w:p>
       <w:pPr>
-        <w:spacing w:after="80" w:line="288" w:lineRule="auto"/>
-        <w:ind w:left="432"/>
-      </w:pPr>
-      <w:r>
-        <w:rPr>
-          <w:rFonts w:ascii="Times New Roman" w:hAnsi="Times New Roman"/>
-          <w:sz w:val="22"/>
-        </w:rPr>
-        <w:t>[9] Facebook Open Source, 'React 18 Architecture: Concurrent Mode, Hooks, and Component Virtual DOM,' Meta Open Source, 2024.</w:t>
+        <w:spacing w:after="50" w:line="276" w:lineRule="auto"/>
+        <w:ind w:left="288"/>
+      </w:pPr>
+      <w:r>
+        <w:rPr>
+          <w:rFonts w:ascii="Times New Roman" w:hAnsi="Times New Roman"/>
+          <w:sz w:val="19"/>
+        </w:rPr>
+        <w:t>[9] Meta Open Source, 'React 18 Architecture: Concurrent Mode and Component Virtual DOM,' 2024.</w:t>
       </w:r>
     </w:p>
     <w:p>
       <w:pPr>
-        <w:spacing w:after="80" w:line="288" w:lineRule="auto"/>
-        <w:ind w:left="432"/>
-      </w:pPr>
-      <w:r>
-        <w:rPr>
-          <w:rFonts w:ascii="Times New Roman" w:hAnsi="Times New Roman"/>
-          <w:sz w:val="22"/>
-        </w:rPr>
-        <w:t>[10] Tamil Nadu Forest Department, 'Metropolitan Chennai Urban Canopy and Tree Health Assessment Manual,' Government of Tamil Nadu, Chennai, 2024.</w:t>
+        <w:spacing w:after="50" w:line="276" w:lineRule="auto"/>
+        <w:ind w:left="288"/>
+      </w:pPr>
+      <w:r>
+        <w:rPr>
+          <w:rFonts w:ascii="Times New Roman" w:hAnsi="Times New Roman"/>
+          <w:sz w:val="19"/>
+        </w:rPr>
+        <w:t>[10] Tamil Nadu Forest Department, 'Metropolitan Chennai Urban Canopy and Tree Health Assessment Manual,' 2024.</w:t>
       </w:r>
     </w:p>
     <w:sectPr>

</xml_diff>

<commit_message>
docs: align Table of Contents and List of Figures with exact Word page numbers starting Chapter 1 on page 13
</commit_message>
<xml_diff>
--- a/Smart_Urban_Green_Management_System_Final_50_Pages_Report.docx
+++ b/Smart_Urban_Green_Management_System_Final_50_Pages_Report.docx
@@ -1127,7 +1127,7 @@
               <w:jc w:val="right"/>
             </w:pPr>
             <w:r>
-              <w:t>7</w:t>
+              <w:t>8</w:t>
             </w:r>
           </w:p>
         </w:tc>
@@ -1180,7 +1180,7 @@
               <w:jc w:val="right"/>
             </w:pPr>
             <w:r>
-              <w:t>8</w:t>
+              <w:t>11</w:t>
             </w:r>
           </w:p>
         </w:tc>
@@ -1233,7 +1233,7 @@
               <w:jc w:val="right"/>
             </w:pPr>
             <w:r>
-              <w:t>9</w:t>
+              <w:t>13</w:t>
             </w:r>
           </w:p>
         </w:tc>
@@ -1286,7 +1286,7 @@
               <w:jc w:val="right"/>
             </w:pPr>
             <w:r>
-              <w:t>9</w:t>
+              <w:t>13</w:t>
             </w:r>
           </w:p>
         </w:tc>
@@ -1339,7 +1339,7 @@
               <w:jc w:val="right"/>
             </w:pPr>
             <w:r>
-              <w:t>10</w:t>
+              <w:t>14</w:t>
             </w:r>
           </w:p>
         </w:tc>
@@ -1392,7 +1392,7 @@
               <w:jc w:val="right"/>
             </w:pPr>
             <w:r>
-              <w:t>11</w:t>
+              <w:t>15</w:t>
             </w:r>
           </w:p>
         </w:tc>
@@ -1445,7 +1445,7 @@
               <w:jc w:val="right"/>
             </w:pPr>
             <w:r>
-              <w:t>12</w:t>
+              <w:t>16</w:t>
             </w:r>
           </w:p>
         </w:tc>
@@ -1498,7 +1498,7 @@
               <w:jc w:val="right"/>
             </w:pPr>
             <w:r>
-              <w:t>13</w:t>
+              <w:t>17</w:t>
             </w:r>
           </w:p>
         </w:tc>
@@ -1551,7 +1551,7 @@
               <w:jc w:val="right"/>
             </w:pPr>
             <w:r>
-              <w:t>14</w:t>
+              <w:t>18</w:t>
             </w:r>
           </w:p>
         </w:tc>
@@ -1604,7 +1604,7 @@
               <w:jc w:val="right"/>
             </w:pPr>
             <w:r>
-              <w:t>14</w:t>
+              <w:t>18</w:t>
             </w:r>
           </w:p>
         </w:tc>
@@ -1657,7 +1657,7 @@
               <w:jc w:val="right"/>
             </w:pPr>
             <w:r>
-              <w:t>15</w:t>
+              <w:t>19</w:t>
             </w:r>
           </w:p>
         </w:tc>
@@ -1710,7 +1710,7 @@
               <w:jc w:val="right"/>
             </w:pPr>
             <w:r>
-              <w:t>16</w:t>
+              <w:t>20</w:t>
             </w:r>
           </w:p>
         </w:tc>
@@ -1763,7 +1763,7 @@
               <w:jc w:val="right"/>
             </w:pPr>
             <w:r>
-              <w:t>17</w:t>
+              <w:t>21</w:t>
             </w:r>
           </w:p>
         </w:tc>
@@ -1816,7 +1816,7 @@
               <w:jc w:val="right"/>
             </w:pPr>
             <w:r>
-              <w:t>17</w:t>
+              <w:t>21</w:t>
             </w:r>
           </w:p>
         </w:tc>
@@ -1869,7 +1869,7 @@
               <w:jc w:val="right"/>
             </w:pPr>
             <w:r>
-              <w:t>18</w:t>
+              <w:t>23</w:t>
             </w:r>
           </w:p>
         </w:tc>
@@ -1922,7 +1922,7 @@
               <w:jc w:val="right"/>
             </w:pPr>
             <w:r>
-              <w:t>19</w:t>
+              <w:t>24</w:t>
             </w:r>
           </w:p>
         </w:tc>
@@ -1975,7 +1975,7 @@
               <w:jc w:val="right"/>
             </w:pPr>
             <w:r>
-              <w:t>20</w:t>
+              <w:t>25</w:t>
             </w:r>
           </w:p>
         </w:tc>
@@ -2028,7 +2028,7 @@
               <w:jc w:val="right"/>
             </w:pPr>
             <w:r>
-              <w:t>21</w:t>
+              <w:t>26</w:t>
             </w:r>
           </w:p>
         </w:tc>
@@ -2081,7 +2081,7 @@
               <w:jc w:val="right"/>
             </w:pPr>
             <w:r>
-              <w:t>21</w:t>
+              <w:t>26</w:t>
             </w:r>
           </w:p>
         </w:tc>
@@ -2134,7 +2134,7 @@
               <w:jc w:val="right"/>
             </w:pPr>
             <w:r>
-              <w:t>22</w:t>
+              <w:t>27</w:t>
             </w:r>
           </w:p>
         </w:tc>
@@ -2187,7 +2187,7 @@
               <w:jc w:val="right"/>
             </w:pPr>
             <w:r>
-              <w:t>23</w:t>
+              <w:t>28</w:t>
             </w:r>
           </w:p>
         </w:tc>
@@ -2282,7 +2282,7 @@
               <w:jc w:val="right"/>
             </w:pPr>
             <w:r>
-              <w:t>24</w:t>
+              <w:t>30</w:t>
             </w:r>
           </w:p>
         </w:tc>
@@ -2319,7 +2319,7 @@
               <w:jc w:val="right"/>
             </w:pPr>
             <w:r>
-              <w:t>25</w:t>
+              <w:t>31</w:t>
             </w:r>
           </w:p>
         </w:tc>
@@ -2356,7 +2356,7 @@
               <w:jc w:val="right"/>
             </w:pPr>
             <w:r>
-              <w:t>26</w:t>
+              <w:t>32</w:t>
             </w:r>
           </w:p>
         </w:tc>
@@ -2393,7 +2393,7 @@
               <w:jc w:val="right"/>
             </w:pPr>
             <w:r>
-              <w:t>27</w:t>
+              <w:t>33</w:t>
             </w:r>
           </w:p>
         </w:tc>
@@ -2430,7 +2430,7 @@
               <w:jc w:val="right"/>
             </w:pPr>
             <w:r>
-              <w:t>28</w:t>
+              <w:t>34</w:t>
             </w:r>
           </w:p>
         </w:tc>
@@ -2467,7 +2467,7 @@
               <w:jc w:val="right"/>
             </w:pPr>
             <w:r>
-              <w:t>28</w:t>
+              <w:t>34</w:t>
             </w:r>
           </w:p>
         </w:tc>
@@ -2504,7 +2504,7 @@
               <w:jc w:val="right"/>
             </w:pPr>
             <w:r>
-              <w:t>29</w:t>
+              <w:t>35</w:t>
             </w:r>
           </w:p>
         </w:tc>
@@ -2541,7 +2541,7 @@
               <w:jc w:val="right"/>
             </w:pPr>
             <w:r>
-              <w:t>30</w:t>
+              <w:t>36</w:t>
             </w:r>
           </w:p>
         </w:tc>
@@ -2578,7 +2578,7 @@
               <w:jc w:val="right"/>
             </w:pPr>
             <w:r>
-              <w:t>31</w:t>
+              <w:t>37</w:t>
             </w:r>
           </w:p>
         </w:tc>
@@ -2615,7 +2615,7 @@
               <w:jc w:val="right"/>
             </w:pPr>
             <w:r>
-              <w:t>32</w:t>
+              <w:t>38</w:t>
             </w:r>
           </w:p>
         </w:tc>
@@ -2652,7 +2652,7 @@
               <w:jc w:val="right"/>
             </w:pPr>
             <w:r>
-              <w:t>33</w:t>
+              <w:t>39</w:t>
             </w:r>
           </w:p>
         </w:tc>
@@ -2689,7 +2689,7 @@
               <w:jc w:val="right"/>
             </w:pPr>
             <w:r>
-              <w:t>33</w:t>
+              <w:t>39</w:t>
             </w:r>
           </w:p>
         </w:tc>
@@ -2726,7 +2726,7 @@
               <w:jc w:val="right"/>
             </w:pPr>
             <w:r>
-              <w:t>34</w:t>
+              <w:t>40</w:t>
             </w:r>
           </w:p>
         </w:tc>
@@ -2763,7 +2763,7 @@
               <w:jc w:val="right"/>
             </w:pPr>
             <w:r>
-              <w:t>35</w:t>
+              <w:t>42</w:t>
             </w:r>
           </w:p>
         </w:tc>
@@ -2800,7 +2800,7 @@
               <w:jc w:val="right"/>
             </w:pPr>
             <w:r>
-              <w:t>36</w:t>
+              <w:t>43</w:t>
             </w:r>
           </w:p>
         </w:tc>
@@ -2837,7 +2837,7 @@
               <w:jc w:val="right"/>
             </w:pPr>
             <w:r>
-              <w:t>36</w:t>
+              <w:t>43</w:t>
             </w:r>
           </w:p>
         </w:tc>
@@ -2874,7 +2874,7 @@
               <w:jc w:val="right"/>
             </w:pPr>
             <w:r>
-              <w:t>37</w:t>
+              <w:t>44</w:t>
             </w:r>
           </w:p>
         </w:tc>
@@ -2911,7 +2911,7 @@
               <w:jc w:val="right"/>
             </w:pPr>
             <w:r>
-              <w:t>38</w:t>
+              <w:t>45</w:t>
             </w:r>
           </w:p>
         </w:tc>
@@ -2948,7 +2948,7 @@
               <w:jc w:val="right"/>
             </w:pPr>
             <w:r>
-              <w:t>38</w:t>
+              <w:t>45</w:t>
             </w:r>
           </w:p>
         </w:tc>
@@ -2985,7 +2985,7 @@
               <w:jc w:val="right"/>
             </w:pPr>
             <w:r>
-              <w:t>39</w:t>
+              <w:t>46</w:t>
             </w:r>
           </w:p>
         </w:tc>
@@ -3022,7 +3022,7 @@
               <w:jc w:val="right"/>
             </w:pPr>
             <w:r>
-              <w:t>40</w:t>
+              <w:t>47</w:t>
             </w:r>
           </w:p>
         </w:tc>
@@ -3059,7 +3059,7 @@
               <w:jc w:val="right"/>
             </w:pPr>
             <w:r>
-              <w:t>41</w:t>
+              <w:t>48</w:t>
             </w:r>
           </w:p>
         </w:tc>
@@ -3096,7 +3096,7 @@
               <w:jc w:val="right"/>
             </w:pPr>
             <w:r>
-              <w:t>42</w:t>
+              <w:t>49</w:t>
             </w:r>
           </w:p>
         </w:tc>
@@ -3133,7 +3133,7 @@
               <w:jc w:val="right"/>
             </w:pPr>
             <w:r>
-              <w:t>43</w:t>
+              <w:t>50</w:t>
             </w:r>
           </w:p>
         </w:tc>
@@ -3170,7 +3170,7 @@
               <w:jc w:val="right"/>
             </w:pPr>
             <w:r>
-              <w:t>44</w:t>
+              <w:t>51</w:t>
             </w:r>
           </w:p>
         </w:tc>
@@ -3207,7 +3207,7 @@
               <w:jc w:val="right"/>
             </w:pPr>
             <w:r>
-              <w:t>45</w:t>
+              <w:t>52</w:t>
             </w:r>
           </w:p>
         </w:tc>
@@ -3244,7 +3244,7 @@
               <w:jc w:val="right"/>
             </w:pPr>
             <w:r>
-              <w:t>46</w:t>
+              <w:t>53</w:t>
             </w:r>
           </w:p>
         </w:tc>
@@ -3281,7 +3281,7 @@
               <w:jc w:val="right"/>
             </w:pPr>
             <w:r>
-              <w:t>47</w:t>
+              <w:t>54</w:t>
             </w:r>
           </w:p>
         </w:tc>
@@ -3318,7 +3318,7 @@
               <w:jc w:val="right"/>
             </w:pPr>
             <w:r>
-              <w:t>48</w:t>
+              <w:t>55</w:t>
             </w:r>
           </w:p>
         </w:tc>
@@ -3336,7 +3336,7 @@
           </w:tcPr>
           <w:p>
             <w:r>
-              <w:t xml:space="preserve">    Section 15 &amp; 16: Three.js 3D Visualizer &amp; Admin Dashboard</w:t>
+              <w:t xml:space="preserve">    Section 15: Three.js 3D Visualizer Component</w:t>
             </w:r>
           </w:p>
         </w:tc>
@@ -3355,7 +3355,44 @@
               <w:jc w:val="right"/>
             </w:pPr>
             <w:r>
-              <w:t>49</w:t>
+              <w:t>56</w:t>
+            </w:r>
+          </w:p>
+        </w:tc>
+      </w:tr>
+      <w:tr>
+        <w:tc>
+          <w:tcPr>
+            <w:tcW w:type="dxa" w:w="4334"/>
+            <w:tcMar>
+              <w:top w:w="35" w:type="dxa"/>
+              <w:bottom w:w="35" w:type="dxa"/>
+              <w:left w:w="50" w:type="dxa"/>
+              <w:right w:w="50" w:type="dxa"/>
+            </w:tcMar>
+          </w:tcPr>
+          <w:p>
+            <w:r>
+              <w:t xml:space="preserve">    Section 16: Admin Command Dashboard</w:t>
+            </w:r>
+          </w:p>
+        </w:tc>
+        <w:tc>
+          <w:tcPr>
+            <w:tcW w:type="dxa" w:w="4334"/>
+            <w:tcMar>
+              <w:top w:w="35" w:type="dxa"/>
+              <w:bottom w:w="35" w:type="dxa"/>
+              <w:left w:w="50" w:type="dxa"/>
+              <w:right w:w="50" w:type="dxa"/>
+            </w:tcMar>
+          </w:tcPr>
+          <w:p>
+            <w:pPr>
+              <w:jc w:val="right"/>
+            </w:pPr>
+            <w:r>
+              <w:t>57</w:t>
             </w:r>
           </w:p>
         </w:tc>
@@ -3392,7 +3429,7 @@
               <w:jc w:val="right"/>
             </w:pPr>
             <w:r>
-              <w:t>50</w:t>
+              <w:t>59</w:t>
             </w:r>
           </w:p>
         </w:tc>
@@ -3446,7 +3483,7 @@
         <w:rPr>
           <w:rFonts w:ascii="Times New Roman" w:hAnsi="Times New Roman"/>
         </w:rPr>
-        <w:t xml:space="preserve">  .................................................................  21</w:t>
+        <w:t xml:space="preserve">  .................................................................  26</w:t>
       </w:r>
     </w:p>
     <w:p>
@@ -3463,7 +3500,7 @@
         <w:rPr>
           <w:rFonts w:ascii="Times New Roman" w:hAnsi="Times New Roman"/>
         </w:rPr>
-        <w:t xml:space="preserve">  .................................................................  22</w:t>
+        <w:t xml:space="preserve">  .................................................................  27</w:t>
       </w:r>
     </w:p>
     <w:p>
@@ -3480,7 +3517,7 @@
         <w:rPr>
           <w:rFonts w:ascii="Times New Roman" w:hAnsi="Times New Roman"/>
         </w:rPr>
-        <w:t xml:space="preserve">  .................................................................  24</w:t>
+        <w:t xml:space="preserve">  .................................................................  30</w:t>
       </w:r>
     </w:p>
     <w:p>
@@ -3497,7 +3534,7 @@
         <w:rPr>
           <w:rFonts w:ascii="Times New Roman" w:hAnsi="Times New Roman"/>
         </w:rPr>
-        <w:t xml:space="preserve">  .................................................................  24</w:t>
+        <w:t xml:space="preserve">  .................................................................  30</w:t>
       </w:r>
     </w:p>
     <w:p>
@@ -3514,7 +3551,7 @@
         <w:rPr>
           <w:rFonts w:ascii="Times New Roman" w:hAnsi="Times New Roman"/>
         </w:rPr>
-        <w:t xml:space="preserve">  .................................................................  25</w:t>
+        <w:t xml:space="preserve">  .................................................................  31</w:t>
       </w:r>
     </w:p>
     <w:p>
@@ -3531,7 +3568,7 @@
         <w:rPr>
           <w:rFonts w:ascii="Times New Roman" w:hAnsi="Times New Roman"/>
         </w:rPr>
-        <w:t xml:space="preserve">  .................................................................  26</w:t>
+        <w:t xml:space="preserve">  .................................................................  32</w:t>
       </w:r>
     </w:p>
     <w:p>
@@ -3548,7 +3585,7 @@
         <w:rPr>
           <w:rFonts w:ascii="Times New Roman" w:hAnsi="Times New Roman"/>
         </w:rPr>
-        <w:t xml:space="preserve">  .................................................................  27</w:t>
+        <w:t xml:space="preserve">  .................................................................  33</w:t>
       </w:r>
     </w:p>
     <w:p>
@@ -3565,7 +3602,7 @@
         <w:rPr>
           <w:rFonts w:ascii="Times New Roman" w:hAnsi="Times New Roman"/>
         </w:rPr>
-        <w:t xml:space="preserve">  .................................................................  30</w:t>
+        <w:t xml:space="preserve">  .................................................................  36</w:t>
       </w:r>
     </w:p>
     <w:p>
@@ -3582,7 +3619,7 @@
         <w:rPr>
           <w:rFonts w:ascii="Times New Roman" w:hAnsi="Times New Roman"/>
         </w:rPr>
-        <w:t xml:space="preserve">  .................................................................  31</w:t>
+        <w:t xml:space="preserve">  .................................................................  37</w:t>
       </w:r>
     </w:p>
     <w:p>
@@ -3599,7 +3636,7 @@
         <w:rPr>
           <w:rFonts w:ascii="Times New Roman" w:hAnsi="Times New Roman"/>
         </w:rPr>
-        <w:t xml:space="preserve">  .................................................................  35</w:t>
+        <w:t xml:space="preserve">  .................................................................  42</w:t>
       </w:r>
     </w:p>
     <w:p>
@@ -3616,7 +3653,7 @@
         <w:rPr>
           <w:rFonts w:ascii="Times New Roman" w:hAnsi="Times New Roman"/>
         </w:rPr>
-        <w:t xml:space="preserve">  .................................................................  50</w:t>
+        <w:t xml:space="preserve">  .................................................................  59</w:t>
       </w:r>
     </w:p>
     <w:p>
@@ -3633,7 +3670,7 @@
         <w:rPr>
           <w:rFonts w:ascii="Times New Roman" w:hAnsi="Times New Roman"/>
         </w:rPr>
-        <w:t xml:space="preserve">  .................................................................  50</w:t>
+        <w:t xml:space="preserve">  .................................................................  59</w:t>
       </w:r>
     </w:p>
     <w:p>
@@ -3665,7 +3702,7 @@
         <w:rPr>
           <w:rFonts w:ascii="Times New Roman" w:hAnsi="Times New Roman"/>
         </w:rPr>
-        <w:t xml:space="preserve">  .................................................................  15</w:t>
+        <w:t xml:space="preserve">  .................................................................  19</w:t>
       </w:r>
     </w:p>
     <w:p>
@@ -3682,7 +3719,7 @@
         <w:rPr>
           <w:rFonts w:ascii="Times New Roman" w:hAnsi="Times New Roman"/>
         </w:rPr>
-        <w:t xml:space="preserve">  .................................................................  19</w:t>
+        <w:t xml:space="preserve">  .................................................................  24</w:t>
       </w:r>
     </w:p>
     <w:p>
@@ -3699,7 +3736,7 @@
         <w:rPr>
           <w:rFonts w:ascii="Times New Roman" w:hAnsi="Times New Roman"/>
         </w:rPr>
-        <w:t xml:space="preserve">  .................................................................  19</w:t>
+        <w:t xml:space="preserve">  .................................................................  24</w:t>
       </w:r>
     </w:p>
     <w:p>
@@ -3716,7 +3753,7 @@
         <w:rPr>
           <w:rFonts w:ascii="Times New Roman" w:hAnsi="Times New Roman"/>
         </w:rPr>
-        <w:t xml:space="preserve">  .................................................................  23</w:t>
+        <w:t xml:space="preserve">  .................................................................  28</w:t>
       </w:r>
     </w:p>
     <w:p>
@@ -3733,7 +3770,7 @@
         <w:rPr>
           <w:rFonts w:ascii="Times New Roman" w:hAnsi="Times New Roman"/>
         </w:rPr>
-        <w:t xml:space="preserve">  .................................................................  34</w:t>
+        <w:t xml:space="preserve">  .................................................................  40</w:t>
       </w:r>
     </w:p>
     <w:p>
@@ -3750,7 +3787,7 @@
         <w:rPr>
           <w:rFonts w:ascii="Times New Roman" w:hAnsi="Times New Roman"/>
         </w:rPr>
-        <w:t xml:space="preserve">  .................................................................  35</w:t>
+        <w:t xml:space="preserve">  .................................................................  42</w:t>
       </w:r>
     </w:p>
     <w:p>

</xml_diff>